<commit_message>
practica de david casi solo falta el mapa
</commit_message>
<xml_diff>
--- a/DAW/Portafolios-3-RicardoSorinAlmajan (1).docx
+++ b/DAW/Portafolios-3-RicardoSorinAlmajan (1).docx
@@ -635,10 +635,7 @@
         <w:t>borrar (</w:t>
       </w:r>
       <w:r>
-        <w:t>…)) este servicio es fácil de mantener y configurar copiando los sistemas o</w:t>
-      </w:r>
-      <w:r>
-        <w:t xml:space="preserve">perativos implicados. </w:t>
+        <w:t xml:space="preserve">…)) este servicio es fácil de mantener y configurar copiando los sistemas operativos implicados. </w:t>
       </w:r>
     </w:p>
     <w:p>
@@ -666,10 +663,7 @@
     </w:p>
     <w:p>
       <w:r>
-        <w:t>- Protocolo FTP: Establece normas para la interacción entre servidores y clientes, empleando TCP como pr</w:t>
-      </w:r>
-      <w:r>
-        <w:t>otocolo de transferencia.</w:t>
+        <w:t>- Protocolo FTP: Establece normas para la interacción entre servidores y clientes, empleando TCP como protocolo de transferencia.</w:t>
       </w:r>
     </w:p>
     <w:p>
@@ -712,10 +706,7 @@
         <w:t>propiedades,</w:t>
       </w:r>
       <w:r>
-        <w:t xml:space="preserve"> así como los accesos modificar conexión y/o tiem</w:t>
-      </w:r>
-      <w:r>
-        <w:t xml:space="preserve">pos de </w:t>
+        <w:t xml:space="preserve"> así como los accesos modificar conexión y/o tiempos de </w:t>
       </w:r>
       <w:r>
         <w:t>espera.</w:t>
@@ -744,10 +735,7 @@
     </w:p>
     <w:p>
       <w:r>
-        <w:t>Los sistemas</w:t>
-      </w:r>
-      <w:r>
-        <w:t xml:space="preserve"> operativos tienen un cliente FTP este se puede llamar desde la línea de comandos, se usa la sintaxis FTP.</w:t>
+        <w:t>Los sistemas operativos tienen un cliente FTP este se puede llamar desde la línea de comandos, se usa la sintaxis FTP.</w:t>
       </w:r>
     </w:p>
     <w:p>
@@ -758,34 +746,7 @@
         <w:t>usuarios como</w:t>
       </w:r>
       <w:r>
-        <w:t xml:space="preserve"> </w:t>
-      </w:r>
-      <w:proofErr w:type="spellStart"/>
-      <w:r>
-        <w:t>ls</w:t>
-      </w:r>
-      <w:proofErr w:type="spellEnd"/>
-      <w:r>
-        <w:t xml:space="preserve">, </w:t>
-      </w:r>
-      <w:proofErr w:type="spellStart"/>
-      <w:r>
-        <w:t>get</w:t>
-      </w:r>
-      <w:proofErr w:type="spellEnd"/>
-      <w:r>
-        <w:t xml:space="preserve">, </w:t>
-      </w:r>
-      <w:proofErr w:type="spellStart"/>
-      <w:r>
-        <w:t>put</w:t>
-      </w:r>
-      <w:proofErr w:type="spellEnd"/>
-      <w:r>
-        <w:t xml:space="preserve">, mget, mput, cd, lcd(...) para acceder la lista de archivos </w:t>
-      </w:r>
-      <w:r>
-        <w:t xml:space="preserve">en los directorios del servidor, empezar a acceder </w:t>
+        <w:t xml:space="preserve"> ls, get, put, mget, mput, cd, lcd(...) para acceder la lista de archivos en los directorios del servidor, empezar a acceder </w:t>
       </w:r>
       <w:r>
         <w:t>a archivos</w:t>
@@ -801,13 +762,8 @@
       <w:r>
         <w:t xml:space="preserve"> antes del comando. Por ejemplo, </w:t>
       </w:r>
-      <w:proofErr w:type="spellStart"/>
-      <w:r>
-        <w:t>ls</w:t>
-      </w:r>
-      <w:proofErr w:type="spellEnd"/>
-      <w:r>
-        <w:t xml:space="preserve"> muestra</w:t>
+      <w:r>
+        <w:t>ls muestra</w:t>
       </w:r>
       <w:r>
         <w:t xml:space="preserve"> un listado del directorio </w:t>
@@ -815,24 +771,8 @@
       <w:r>
         <w:t>actual, !</w:t>
       </w:r>
-      <w:proofErr w:type="spellStart"/>
-      <w:r>
-        <w:t>ls</w:t>
-      </w:r>
-      <w:proofErr w:type="spellEnd"/>
-      <w:r>
-        <w:t xml:space="preserve"> o !</w:t>
-      </w:r>
-      <w:proofErr w:type="spellStart"/>
-      <w:r>
-        <w:t>dir</w:t>
-      </w:r>
-      <w:proofErr w:type="spellEnd"/>
-      <w:r>
-        <w:t xml:space="preserve">  muestran el listado del direct</w:t>
-      </w:r>
-      <w:r>
-        <w:t>orio actual. Existe una excepción llamada comando cd, al ejecutarlo localmente se debe utilizar lcd en lugar de !cd.</w:t>
+      <w:r>
+        <w:t>ls o !dir  muestran el listado del directorio actual. Existe una excepción llamada comando cd, al ejecutarlo localmente se debe utilizar lcd en lugar de !cd.</w:t>
       </w:r>
     </w:p>
     <w:p/>
@@ -861,10 +801,7 @@
         <w:t>más</w:t>
       </w:r>
       <w:r>
-        <w:t xml:space="preserve"> opciones c</w:t>
-      </w:r>
-      <w:r>
-        <w:t>omo editar fichero…</w:t>
+        <w:t xml:space="preserve"> opciones como editar fichero…</w:t>
       </w:r>
     </w:p>
     <w:p>
@@ -905,7 +842,21 @@
           <w:color w:val="000000"/>
           <w:highlight w:val="white"/>
         </w:rPr>
-        <w:t>…), tienen la capacidad de funcionar como clientes ftp. Se debe especificar en la dirección a qué s</w:t>
+        <w:t>…), tienen la capacidad de funcionar como clientes ftp. Se debe especificar en la dirección a qué servidor FTP se va a conectar para poder usarlo.</w:t>
+      </w:r>
+      <w:r>
+        <w:rPr>
+          <w:rFonts w:ascii="Quattrocento Sans" w:eastAsia="Quattrocento Sans" w:hAnsi="Quattrocento Sans" w:cs="Quattrocento Sans"/>
+          <w:color w:val="000000"/>
+        </w:rPr>
+        <w:br/>
+      </w:r>
+      <w:r>
+        <w:rPr>
+          <w:rFonts w:ascii="Quattrocento Sans" w:eastAsia="Quattrocento Sans" w:hAnsi="Quattrocento Sans" w:cs="Quattrocento Sans"/>
+          <w:color w:val="000000"/>
+        </w:rPr>
+        <w:br/>
       </w:r>
       <w:r>
         <w:rPr>
@@ -913,7 +864,42 @@
           <w:color w:val="000000"/>
           <w:highlight w:val="white"/>
         </w:rPr>
-        <w:t>ervidor FTP se va a conectar para poder usarlo.</w:t>
+        <w:t>Estructura habitual: ftp [usuario][contraseña]@servidor</w:t>
+      </w:r>
+      <w:r>
+        <w:rPr>
+          <w:rFonts w:ascii="Quattrocento Sans" w:eastAsia="Quattrocento Sans" w:hAnsi="Quattrocento Sans" w:cs="Quattrocento Sans"/>
+          <w:color w:val="000000"/>
+        </w:rPr>
+        <w:br/>
+      </w:r>
+      <w:r>
+        <w:rPr>
+          <w:rFonts w:ascii="Quattrocento Sans" w:eastAsia="Quattrocento Sans" w:hAnsi="Quattrocento Sans" w:cs="Quattrocento Sans"/>
+          <w:color w:val="000000"/>
+        </w:rPr>
+        <w:br/>
+      </w:r>
+      <w:r>
+        <w:rPr>
+          <w:rFonts w:ascii="Quattrocento Sans" w:eastAsia="Quattrocento Sans" w:hAnsi="Quattrocento Sans" w:cs="Quattrocento Sans"/>
+          <w:highlight w:val="white"/>
+        </w:rPr>
+        <w:t xml:space="preserve">Con el usuario </w:t>
+      </w:r>
+      <w:r>
+        <w:rPr>
+          <w:rFonts w:ascii="Quattrocento Sans" w:eastAsia="Quattrocento Sans" w:hAnsi="Quattrocento Sans" w:cs="Quattrocento Sans"/>
+          <w:highlight w:val="white"/>
+        </w:rPr>
+        <w:t>Anonymous</w:t>
+      </w:r>
+      <w:r>
+        <w:rPr>
+          <w:rFonts w:ascii="Quattrocento Sans" w:eastAsia="Quattrocento Sans" w:hAnsi="Quattrocento Sans" w:cs="Quattrocento Sans"/>
+          <w:highlight w:val="white"/>
+        </w:rPr>
+        <w:t xml:space="preserve"> no hace falta ni usuario ni contraseña.</w:t>
       </w:r>
       <w:r>
         <w:rPr>
@@ -935,7 +921,7 @@
           <w:color w:val="000000"/>
           <w:highlight w:val="white"/>
         </w:rPr>
-        <w:t>Estructura habitual: ftp [usuario][contraseña]@servidor</w:t>
+        <w:t>Utilizan por defecto el modo activo (que se describe más adelante).</w:t>
       </w:r>
       <w:r>
         <w:rPr>
@@ -956,35 +942,35 @@
           <w:rFonts w:ascii="Quattrocento Sans" w:eastAsia="Quattrocento Sans" w:hAnsi="Quattrocento Sans" w:cs="Quattrocento Sans"/>
           <w:highlight w:val="white"/>
         </w:rPr>
-        <w:t xml:space="preserve">Con el usuario </w:t>
+        <w:t xml:space="preserve">El cliente FTP es </w:t>
       </w:r>
       <w:r>
         <w:rPr>
           <w:rFonts w:ascii="Quattrocento Sans" w:eastAsia="Quattrocento Sans" w:hAnsi="Quattrocento Sans" w:cs="Quattrocento Sans"/>
           <w:highlight w:val="white"/>
         </w:rPr>
-        <w:t>Anonymous</w:t>
+        <w:t>fácil</w:t>
       </w:r>
       <w:r>
         <w:rPr>
           <w:rFonts w:ascii="Quattrocento Sans" w:eastAsia="Quattrocento Sans" w:hAnsi="Quattrocento Sans" w:cs="Quattrocento Sans"/>
           <w:highlight w:val="white"/>
         </w:rPr>
-        <w:t xml:space="preserve"> no hace falta ni usuario ni contraseña.</w:t>
+        <w:t xml:space="preserve"> de </w:t>
       </w:r>
       <w:r>
         <w:rPr>
           <w:rFonts w:ascii="Quattrocento Sans" w:eastAsia="Quattrocento Sans" w:hAnsi="Quattrocento Sans" w:cs="Quattrocento Sans"/>
-          <w:color w:val="000000"/>
-        </w:rPr>
-        <w:br/>
+          <w:highlight w:val="white"/>
+        </w:rPr>
+        <w:t>usar,</w:t>
       </w:r>
       <w:r>
         <w:rPr>
           <w:rFonts w:ascii="Quattrocento Sans" w:eastAsia="Quattrocento Sans" w:hAnsi="Quattrocento Sans" w:cs="Quattrocento Sans"/>
-          <w:color w:val="000000"/>
-        </w:rPr>
-        <w:br/>
+          <w:highlight w:val="white"/>
+        </w:rPr>
+        <w:t xml:space="preserve"> pero presenta limitaciones</w:t>
       </w:r>
       <w:r>
         <w:rPr>
@@ -992,70 +978,6 @@
           <w:color w:val="000000"/>
           <w:highlight w:val="white"/>
         </w:rPr>
-        <w:t>Utilizan por defecto el modo activo (que se describe más adelante).</w:t>
-      </w:r>
-      <w:r>
-        <w:rPr>
-          <w:rFonts w:ascii="Quattrocento Sans" w:eastAsia="Quattrocento Sans" w:hAnsi="Quattrocento Sans" w:cs="Quattrocento Sans"/>
-          <w:color w:val="000000"/>
-        </w:rPr>
-        <w:br/>
-      </w:r>
-      <w:r>
-        <w:rPr>
-          <w:rFonts w:ascii="Quattrocento Sans" w:eastAsia="Quattrocento Sans" w:hAnsi="Quattrocento Sans" w:cs="Quattrocento Sans"/>
-          <w:color w:val="000000"/>
-        </w:rPr>
-        <w:br/>
-      </w:r>
-      <w:r>
-        <w:rPr>
-          <w:rFonts w:ascii="Quattrocento Sans" w:eastAsia="Quattrocento Sans" w:hAnsi="Quattrocento Sans" w:cs="Quattrocento Sans"/>
-          <w:highlight w:val="white"/>
-        </w:rPr>
-        <w:t xml:space="preserve">El cliente FTP </w:t>
-      </w:r>
-      <w:r>
-        <w:rPr>
-          <w:rFonts w:ascii="Quattrocento Sans" w:eastAsia="Quattrocento Sans" w:hAnsi="Quattrocento Sans" w:cs="Quattrocento Sans"/>
-          <w:highlight w:val="white"/>
-        </w:rPr>
-        <w:t xml:space="preserve">es </w:t>
-      </w:r>
-      <w:r>
-        <w:rPr>
-          <w:rFonts w:ascii="Quattrocento Sans" w:eastAsia="Quattrocento Sans" w:hAnsi="Quattrocento Sans" w:cs="Quattrocento Sans"/>
-          <w:highlight w:val="white"/>
-        </w:rPr>
-        <w:t>fácil</w:t>
-      </w:r>
-      <w:r>
-        <w:rPr>
-          <w:rFonts w:ascii="Quattrocento Sans" w:eastAsia="Quattrocento Sans" w:hAnsi="Quattrocento Sans" w:cs="Quattrocento Sans"/>
-          <w:highlight w:val="white"/>
-        </w:rPr>
-        <w:t xml:space="preserve"> de </w:t>
-      </w:r>
-      <w:r>
-        <w:rPr>
-          <w:rFonts w:ascii="Quattrocento Sans" w:eastAsia="Quattrocento Sans" w:hAnsi="Quattrocento Sans" w:cs="Quattrocento Sans"/>
-          <w:highlight w:val="white"/>
-        </w:rPr>
-        <w:t>usar,</w:t>
-      </w:r>
-      <w:r>
-        <w:rPr>
-          <w:rFonts w:ascii="Quattrocento Sans" w:eastAsia="Quattrocento Sans" w:hAnsi="Quattrocento Sans" w:cs="Quattrocento Sans"/>
-          <w:highlight w:val="white"/>
-        </w:rPr>
-        <w:t xml:space="preserve"> pero presenta limitaciones</w:t>
-      </w:r>
-      <w:r>
-        <w:rPr>
-          <w:rFonts w:ascii="Quattrocento Sans" w:eastAsia="Quattrocento Sans" w:hAnsi="Quattrocento Sans" w:cs="Quattrocento Sans"/>
-          <w:color w:val="000000"/>
-          <w:highlight w:val="white"/>
-        </w:rPr>
         <w:t>. Se puede instalar extensiones adicionales que ofrecen clientes FTP más avanzados.</w:t>
       </w:r>
     </w:p>
@@ -1069,10 +991,7 @@
     </w:p>
     <w:p>
       <w:r>
-        <w:t>La comunicación implica la transmisión de mensajes escritos que incluyen instrucciones y contestaciones. Emplea TC</w:t>
-      </w:r>
-      <w:r>
-        <w:t>P como su protocolo de transporte.</w:t>
+        <w:t>La comunicación implica la transmisión de mensajes escritos que incluyen instrucciones y contestaciones. Emplea TCP como su protocolo de transporte.</w:t>
       </w:r>
     </w:p>
     <w:p>
@@ -1085,10 +1004,7 @@
     </w:p>
     <w:p>
       <w:r>
-        <w:t>Los mensajes FTP son generados por el servidor después de ejecutar un comando recibido</w:t>
-      </w:r>
-      <w:r>
-        <w:t>. Consisten en un código de 3 dígitos que refleja la forma en que se ha ejecutado la orden, junto con un texto explicativo. Los números definen la categoría de respuesta.</w:t>
+        <w:t>Los mensajes FTP son generados por el servidor después de ejecutar un comando recibido. Consisten en un código de 3 dígitos que refleja la forma en que se ha ejecutado la orden, junto con un texto explicativo. Los números definen la categoría de respuesta.</w:t>
       </w:r>
     </w:p>
     <w:p>
@@ -1237,15 +1153,7 @@
           <w:color w:val="000000"/>
           <w:highlight w:val="white"/>
         </w:rPr>
-        <w:t>Generalmente, el usuario anónimo solo puede descargar archivos y su acceso se restringe a un directorio de</w:t>
-      </w:r>
-      <w:r>
-        <w:rPr>
-          <w:rFonts w:ascii="Quattrocento Sans" w:eastAsia="Quattrocento Sans" w:hAnsi="Quattrocento Sans" w:cs="Quattrocento Sans"/>
-          <w:color w:val="000000"/>
-          <w:highlight w:val="white"/>
-        </w:rPr>
-        <w:t>l servidor, aunque el administrador del servidor FTP podría optar por otra configuración.</w:t>
+        <w:t>Generalmente, el usuario anónimo solo puede descargar archivos y su acceso se restringe a un directorio del servidor, aunque el administrador del servidor FTP podría optar por otra configuración.</w:t>
       </w:r>
     </w:p>
     <w:p>
@@ -1436,6 +1344,7 @@
         <w:rPr>
           <w:color w:val="000000"/>
         </w:rPr>
+        <w:lastRenderedPageBreak/>
         <w:t xml:space="preserve">Usuarios que “constan” en </w:t>
       </w:r>
       <w:r>
@@ -1471,7 +1380,6 @@
           <w:color w:val="000000"/>
           <w:u w:val="single"/>
         </w:rPr>
-        <w:lastRenderedPageBreak/>
         <w:t>Usuarios ficticios utilizados para ingresar al FTP</w:t>
       </w:r>
       <w:r>
@@ -1533,13 +1441,7 @@
         <w:rPr>
           <w:color w:val="000000"/>
         </w:rPr>
-        <w:t>En el se</w:t>
-      </w:r>
-      <w:r>
-        <w:rPr>
-          <w:color w:val="000000"/>
-        </w:rPr>
-        <w:t>rvidor se establecen los permisos de usuario.</w:t>
+        <w:t>En el servidor se establecen los permisos de usuario.</w:t>
       </w:r>
     </w:p>
     <w:p>
@@ -1577,15 +1479,7 @@
           <w:color w:val="000000"/>
           <w:highlight w:val="white"/>
         </w:rPr>
-        <w:t>De primeras, el cliente inicia una comunicación con el servidor para interactuar con él. Envía instrucciones de descarga (get), carga (put), listado (ls), entre otros, y recibe respuestas del servidor que indican cómo se manejan las solicitudes. La conexió</w:t>
-      </w:r>
-      <w:r>
-        <w:rPr>
-          <w:rFonts w:ascii="Quattrocento Sans" w:eastAsia="Quattrocento Sans" w:hAnsi="Quattrocento Sans" w:cs="Quattrocento Sans"/>
-          <w:color w:val="000000"/>
-          <w:highlight w:val="white"/>
-        </w:rPr>
-        <w:t>n se mantiene en uso hasta que el usuario salga o el servidor la cierre por inactividad (timeout). Los servidores tienen la capacidad de manejar varias conexiones de control al mismo tiempo.</w:t>
+        <w:t>De primeras, el cliente inicia una comunicación con el servidor para interactuar con él. Envía instrucciones de descarga (get), carga (put), listado (ls), entre otros, y recibe respuestas del servidor que indican cómo se manejan las solicitudes. La conexión se mantiene en uso hasta que el usuario salga o el servidor la cierre por inactividad (timeout). Los servidores tienen la capacidad de manejar varias conexiones de control al mismo tiempo.</w:t>
       </w:r>
     </w:p>
     <w:p>
@@ -1604,10 +1498,7 @@
         <w:t>transferencia</w:t>
       </w:r>
       <w:r>
-        <w:t xml:space="preserve"> de datos,</w:t>
-      </w:r>
-      <w:r>
-        <w:t xml:space="preserve"> se añadir una conexión adicional l que se acaba al completarse la </w:t>
+        <w:t xml:space="preserve"> de datos, se añadir una conexión adicional l que se acaba al completarse la </w:t>
       </w:r>
       <w:r>
         <w:t>acción</w:t>
@@ -1638,10 +1529,7 @@
     </w:p>
     <w:p>
       <w:r>
-        <w:t>De f</w:t>
-      </w:r>
-      <w:r>
-        <w:t xml:space="preserve">orma general no se transmiten datos a través de la conexión de control y nunca se envían comandos de control a través de la </w:t>
+        <w:t xml:space="preserve">De forma general no se transmiten datos a través de la conexión de control y nunca se envían comandos de control a través de la </w:t>
       </w:r>
       <w:r>
         <w:t>conexión</w:t>
@@ -1652,10 +1540,7 @@
     </w:p>
     <w:p>
       <w:r>
-        <w:t>Al principio, los servidores FTP utilizaban el puerto 21 para gestionar las conexiones de control (se mantiene) y</w:t>
-      </w:r>
-      <w:r>
-        <w:t xml:space="preserve"> el puerto 20 para establecer las conexiones de datos. </w:t>
+        <w:t xml:space="preserve">Al principio, los servidores FTP utilizaban el puerto 21 para gestionar las conexiones de control (se mantiene) y el puerto 20 para establecer las conexiones de datos. </w:t>
       </w:r>
       <w:r>
         <w:t>Actualmente, no</w:t>
@@ -1689,10 +1574,7 @@
         <w:ind w:left="720"/>
       </w:pPr>
       <w:r>
-        <w:t>En el modo pasivo, el cliente siempre indic</w:t>
-      </w:r>
-      <w:r>
-        <w:t>a los puntos de conexión. El puerto 20 del servidor no se utiliza.</w:t>
+        <w:t>En el modo pasivo, el cliente siempre indica los puntos de conexión. El puerto 20 del servidor no se utiliza.</w:t>
       </w:r>
     </w:p>
     <w:p>
@@ -1722,10 +1604,7 @@
         <w:ind w:firstLine="720"/>
       </w:pPr>
       <w:r>
-        <w:t xml:space="preserve"> Cuando se so</w:t>
-      </w:r>
-      <w:r>
-        <w:t>licita una transferencia de ficheros:</w:t>
+        <w:t xml:space="preserve"> Cuando se solicita una transferencia de ficheros:</w:t>
       </w:r>
     </w:p>
     <w:p>
@@ -1753,10 +1632,7 @@
         <w:t>conexión</w:t>
       </w:r>
       <w:r>
-        <w:t xml:space="preserve"> de datos para l</w:t>
-      </w:r>
-      <w:r>
-        <w:t xml:space="preserve">a </w:t>
+        <w:t xml:space="preserve"> de datos para la </w:t>
       </w:r>
       <w:r>
         <w:t>transferencia</w:t>
@@ -1776,6 +1652,7 @@
         <w:ind w:left="720"/>
       </w:pPr>
       <w:r>
+        <w:lastRenderedPageBreak/>
         <w:t xml:space="preserve"> </w:t>
       </w:r>
     </w:p>
@@ -1793,7 +1670,6 @@
       <w:bookmarkStart w:id="0" w:name="_heading=h.eerjtvqy9b5p" w:colFirst="0" w:colLast="0"/>
       <w:bookmarkEnd w:id="0"/>
       <w:r>
-        <w:lastRenderedPageBreak/>
         <w:t>Modo pasivo:</w:t>
       </w:r>
     </w:p>
@@ -1825,10 +1701,7 @@
         <w:ind w:left="708"/>
       </w:pPr>
       <w:r>
-        <w:t xml:space="preserve">La máquina donde se ejecuta el servidor tiene que aceptar conexiones en varios puertos, </w:t>
-      </w:r>
-      <w:r>
-        <w:t>esto supone una amenaza de seguridad para el equipo, los cortafuegos actuales nos permiten realizar seguimientos de conexiones de datos comprobando si los usuarios que solicitan el puerto y los que se conectan son el mismo.</w:t>
+        <w:t>La máquina donde se ejecuta el servidor tiene que aceptar conexiones en varios puertos, esto supone una amenaza de seguridad para el equipo, los cortafuegos actuales nos permiten realizar seguimientos de conexiones de datos comprobando si los usuarios que solicitan el puerto y los que se conectan son el mismo.</w:t>
       </w:r>
     </w:p>
     <w:p>
@@ -1836,10 +1709,7 @@
         <w:ind w:left="708"/>
       </w:pPr>
       <w:r>
-        <w:t>Si el servidor es de tipo NATP h</w:t>
-      </w:r>
-      <w:r>
-        <w:t>ay que configurar la IP externa del NATP y el rango de puertos aceptados, después hay que redirigir el rango de puertos del encaminador que realiza NATP al equipo del FTP.</w:t>
+        <w:t>Si el servidor es de tipo NATP hay que configurar la IP externa del NATP y el rango de puertos aceptados, después hay que redirigir el rango de puertos del encaminador que realiza NATP al equipo del FTP.</w:t>
       </w:r>
     </w:p>
     <w:p>
@@ -1898,13 +1768,8 @@
       <w:r>
         <w:t>Formato ASCII:  Se transmite byte por byte. Para archivos de texto (</w:t>
       </w:r>
-      <w:proofErr w:type="spellStart"/>
-      <w:r>
-        <w:t>txt</w:t>
-      </w:r>
-      <w:proofErr w:type="spellEnd"/>
-      <w:r>
-        <w:t>, HTML</w:t>
+      <w:r>
+        <w:t>txt, HTML</w:t>
       </w:r>
       <w:r>
         <w:t>, java…)</w:t>
@@ -1953,10 +1818,7 @@
         <w:ind w:left="720"/>
       </w:pPr>
       <w:r>
-        <w:t>FTP no es seguro, está diseñado para ofrecer velocidad no seguridad, se utilizan mecani</w:t>
-      </w:r>
-      <w:r>
-        <w:t>smos de verificación de usuarios para atribuir los privilegios de acceso/transferencia en el servidor, no obstante:</w:t>
+        <w:t>FTP no es seguro, está diseñado para ofrecer velocidad no seguridad, se utilizan mecanismos de verificación de usuarios para atribuir los privilegios de acceso/transferencia en el servidor, no obstante:</w:t>
       </w:r>
     </w:p>
     <w:p>
@@ -1972,10 +1834,7 @@
         <w:ind w:left="720"/>
       </w:pPr>
       <w:r>
-        <w:t xml:space="preserve"> Los intercambios de informaci</w:t>
-      </w:r>
-      <w:r>
-        <w:t>ón se realizan en texto plano sin la existencia de ninguna forma de cifrado, es vulnerable a sufrir ataques de análisis de red.</w:t>
+        <w:t xml:space="preserve"> Los intercambios de información se realizan en texto plano sin la existencia de ninguna forma de cifrado, es vulnerable a sufrir ataques de análisis de red.</w:t>
       </w:r>
     </w:p>
     <w:p>
@@ -2024,10 +1883,7 @@
         <w:ind w:left="720"/>
       </w:pPr>
       <w:r>
-        <w:t>Son un conjunto de especificaciones que son determinadas para el en</w:t>
-      </w:r>
-      <w:r>
-        <w:t>capsulamiento del FTP en SSL o en TLS para hacerlo más seguro, gracias a esto el uso de algoritmos criptográficos y certificados digitales se puede asegurar la confidencialidad y la seguridad de la información</w:t>
+        <w:t>Son un conjunto de especificaciones que son determinadas para el encapsulamiento del FTP en SSL o en TLS para hacerlo más seguro, gracias a esto el uso de algoritmos criptográficos y certificados digitales se puede asegurar la confidencialidad y la seguridad de la información</w:t>
       </w:r>
     </w:p>
     <w:p>
@@ -2043,10 +1899,7 @@
         <w:ind w:left="720"/>
       </w:pPr>
       <w:r>
-        <w:t>El cliente establece la conexi</w:t>
-      </w:r>
-      <w:r>
-        <w:t xml:space="preserve">ón SSL/TLS de control, si el servidor no soporta FTPS se cerrará la sesión. Todas las comunicaciones son </w:t>
+        <w:t xml:space="preserve">El cliente establece la conexión SSL/TLS de control, si el servidor no soporta FTPS se cerrará la sesión. Todas las comunicaciones son </w:t>
       </w:r>
       <w:r>
         <w:t>cifradas</w:t>
@@ -2074,10 +1927,7 @@
         <w:ind w:left="720"/>
       </w:pPr>
       <w:r>
-        <w:t>E</w:t>
-      </w:r>
-      <w:r>
-        <w:t>l cliente entabla una conexión al puerto default,</w:t>
+        <w:t>El cliente entabla una conexión al puerto default,</w:t>
       </w:r>
       <w:r>
         <w:t>21,</w:t>
@@ -2097,10 +1947,7 @@
         <w:ind w:left="720"/>
       </w:pPr>
       <w:r>
-        <w:t xml:space="preserve"> Si el servidor no lo soporta le dará la opción al </w:t>
-      </w:r>
-      <w:r>
-        <w:t xml:space="preserve">usuario de utilizar FTP, donde el usuario y el servidor podrá decidir </w:t>
+        <w:t xml:space="preserve"> Si el servidor no lo soporta le dará la opción al usuario de utilizar FTP, donde el usuario y el servidor podrá decidir </w:t>
       </w:r>
       <w:r>
         <w:t>las comunicaciones</w:t>
@@ -2147,15 +1994,7 @@
         </w:numPr>
       </w:pPr>
       <w:r>
-        <w:t>P2P (Peer-</w:t>
-      </w:r>
-      <w:proofErr w:type="spellStart"/>
-      <w:r>
-        <w:t>to</w:t>
-      </w:r>
-      <w:proofErr w:type="spellEnd"/>
-      <w:r>
-        <w:t>-Peer)</w:t>
+        <w:t>P2P (Peer-to-Peer)</w:t>
       </w:r>
     </w:p>
     <w:p>
@@ -2163,10 +2002,7 @@
         <w:pStyle w:val="Prrafodelista"/>
       </w:pPr>
       <w:r>
-        <w:t xml:space="preserve">Los equipos actúan de equipo y de servidores compartiendo archivos directamente su uso principal es el de cambiar archivos grandes </w:t>
-      </w:r>
-      <w:r>
-        <w:t>en redes distribuidas (ej. BitTorrent).</w:t>
+        <w:t>Los equipos actúan de equipo y de servidores compartiendo archivos directamente su uso principal es el de cambiar archivos grandes en redes distribuidas (ej. BitTorrent).</w:t>
       </w:r>
     </w:p>
     <w:p>
@@ -2174,42 +2010,40 @@
         <w:pStyle w:val="Prrafodelista"/>
       </w:pPr>
       <w:r>
-        <w:t xml:space="preserve">La principal ventaja es de que es </w:t>
-      </w:r>
-      <w:proofErr w:type="spellStart"/>
-      <w:r>
-        <w:t>escalabe</w:t>
-      </w:r>
-      <w:proofErr w:type="spellEnd"/>
+        <w:t xml:space="preserve">La principal ventaja es </w:t>
+      </w:r>
+      <w:r>
+        <w:t>que</w:t>
+      </w:r>
+      <w:r>
+        <w:t xml:space="preserve"> es </w:t>
+      </w:r>
+      <w:r>
+        <w:t>escalab</w:t>
+      </w:r>
+      <w:r>
+        <w:t>le</w:t>
+      </w:r>
       <w:r>
         <w:t xml:space="preserve"> y sin servidor </w:t>
       </w:r>
-      <w:proofErr w:type="gramStart"/>
-      <w:r>
-        <w:t>central</w:t>
-      </w:r>
-      <w:r>
-        <w:t xml:space="preserve"> ,la</w:t>
-      </w:r>
-      <w:proofErr w:type="gramEnd"/>
+      <w:r>
+        <w:t>central, la</w:t>
+      </w:r>
       <w:r>
         <w:t xml:space="preserve"> </w:t>
       </w:r>
-      <w:proofErr w:type="spellStart"/>
-      <w:r>
-        <w:t>difrecnia</w:t>
-      </w:r>
-      <w:proofErr w:type="spellEnd"/>
+      <w:r>
+        <w:t>diferencia</w:t>
+      </w:r>
       <w:r>
         <w:t xml:space="preserve"> a los demás es que la red es </w:t>
       </w:r>
-      <w:proofErr w:type="spellStart"/>
-      <w:r>
-        <w:t>distibuida</w:t>
-      </w:r>
-      <w:proofErr w:type="spellEnd"/>
-      <w:r>
-        <w:t xml:space="preserve"> , todos los nodos comparten datos.</w:t>
+      <w:r>
+        <w:t>distribuida,</w:t>
+      </w:r>
+      <w:r>
+        <w:t xml:space="preserve"> todos los nodos comparten datos.</w:t>
       </w:r>
     </w:p>
     <w:p>
@@ -2221,27 +2055,99 @@
         </w:numPr>
       </w:pPr>
       <w:r>
-        <w:t xml:space="preserve">SMB (Server </w:t>
-      </w:r>
-      <w:proofErr w:type="spellStart"/>
-      <w:r>
-        <w:t>Message</w:t>
-      </w:r>
-      <w:proofErr w:type="spellEnd"/>
-      <w:r>
-        <w:t xml:space="preserve"> Block)</w:t>
+        <w:t>SMB (Server Message Block)</w:t>
       </w:r>
     </w:p>
     <w:p>
       <w:pPr>
         <w:pStyle w:val="Prrafodelista"/>
       </w:pPr>
+      <w:r>
+        <w:t xml:space="preserve">Sistema de comunicación para el cliente y el servidor para compartir archivos y recursos en </w:t>
+      </w:r>
+      <w:r>
+        <w:t>LAN, sirve</w:t>
+      </w:r>
+      <w:r>
+        <w:t xml:space="preserve"> </w:t>
+      </w:r>
+      <w:r>
+        <w:t>para</w:t>
+      </w:r>
+      <w:r>
+        <w:t xml:space="preserve"> </w:t>
+      </w:r>
+      <w:r>
+        <w:t>equipos de</w:t>
+      </w:r>
+      <w:r>
+        <w:t xml:space="preserve"> almacenamiento red y redes </w:t>
+      </w:r>
+      <w:r>
+        <w:t>Windows</w:t>
+      </w:r>
+      <w:r>
+        <w:t>, algunos beneficios de este sistema es la protección una desventaja seria que requiere de un servidor local.</w:t>
+      </w:r>
+    </w:p>
+    <w:p>
+      <w:pPr>
+        <w:pStyle w:val="Prrafodelista"/>
+        <w:numPr>
+          <w:ilvl w:val="0"/>
+          <w:numId w:val="5"/>
+        </w:numPr>
+      </w:pPr>
+      <w:r>
+        <w:t>File Transfer Protocol (FTP)</w:t>
+      </w:r>
+    </w:p>
+    <w:p>
+      <w:pPr>
+        <w:pStyle w:val="Prrafodelista"/>
+      </w:pPr>
+      <w:r>
+        <w:t xml:space="preserve">Intercambio de archivos entre cliente y servidor mediante </w:t>
+      </w:r>
+      <w:r>
+        <w:t>protocolos</w:t>
+      </w:r>
+      <w:r>
+        <w:t xml:space="preserve"> TCP/IP su funcionalidad principal es la de </w:t>
+      </w:r>
+      <w:r>
+        <w:t>cargar</w:t>
+      </w:r>
+      <w:r>
+        <w:t xml:space="preserve"> y descargar archivos de internet es fácil de usar en diferentes plataformas </w:t>
+      </w:r>
+      <w:r>
+        <w:t xml:space="preserve">de principal </w:t>
+      </w:r>
+      <w:r>
+        <w:t>desventaja</w:t>
+      </w:r>
+      <w:r>
+        <w:t xml:space="preserve"> seria que requiere un servidor FTP y no usa un cifrado de </w:t>
+      </w:r>
+      <w:r>
+        <w:t>forma</w:t>
+      </w:r>
+      <w:r>
+        <w:t xml:space="preserve"> predeterminada.</w:t>
+      </w:r>
+    </w:p>
+    <w:p>
+      <w:pPr>
+        <w:pStyle w:val="Prrafodelista"/>
+      </w:pPr>
     </w:p>
     <w:p>
       <w:pPr>
         <w:pStyle w:val="Ttulo2"/>
       </w:pPr>
       <w:r>
+        <w:lastRenderedPageBreak/>
         <w:t>Investiga y realiza una comparativa entre distintos servidores(software) FTP</w:t>
       </w:r>
     </w:p>
@@ -2250,30 +2156,884 @@
         <w:pStyle w:val="Ttulo2"/>
       </w:pPr>
       <w:r>
-        <w:t xml:space="preserve">¿Qué son los </w:t>
-      </w:r>
-      <w:proofErr w:type="spellStart"/>
-      <w:r>
-        <w:t>RFCs</w:t>
-      </w:r>
-      <w:proofErr w:type="spellEnd"/>
-      <w:r>
-        <w:t>?</w:t>
-      </w:r>
-    </w:p>
+        <w:t>¿Qué son los RFCs?</w:t>
+      </w:r>
+    </w:p>
+    <w:tbl>
+      <w:tblPr>
+        <w:tblStyle w:val="Tablaconcuadrcula"/>
+        <w:tblW w:w="0" w:type="auto"/>
+        <w:jc w:val="center"/>
+        <w:tblLook w:val="04A0" w:firstRow="1" w:lastRow="0" w:firstColumn="1" w:lastColumn="0" w:noHBand="0" w:noVBand="1"/>
+      </w:tblPr>
+      <w:tblGrid>
+        <w:gridCol w:w="1698"/>
+        <w:gridCol w:w="1699"/>
+        <w:gridCol w:w="1843"/>
+        <w:gridCol w:w="1555"/>
+        <w:gridCol w:w="1699"/>
+      </w:tblGrid>
+      <w:tr>
+        <w:trPr>
+          <w:trHeight w:val="1077"/>
+          <w:jc w:val="center"/>
+        </w:trPr>
+        <w:tc>
+          <w:tcPr>
+            <w:tcW w:w="1698" w:type="dxa"/>
+            <w:vAlign w:val="center"/>
+          </w:tcPr>
+          <w:p/>
+          <w:p>
+            <w:r>
+              <w:t>Servidor FTP</w:t>
+            </w:r>
+          </w:p>
+        </w:tc>
+        <w:tc>
+          <w:tcPr>
+            <w:tcW w:w="1699" w:type="dxa"/>
+            <w:vAlign w:val="center"/>
+          </w:tcPr>
+          <w:p>
+            <w:r>
+              <w:t>Plataforma</w:t>
+            </w:r>
+            <w:r>
+              <w:tab/>
+            </w:r>
+          </w:p>
+        </w:tc>
+        <w:tc>
+          <w:tcPr>
+            <w:tcW w:w="1843" w:type="dxa"/>
+            <w:vAlign w:val="center"/>
+          </w:tcPr>
+          <w:p>
+            <w:r>
+              <w:t>Protocolos</w:t>
+            </w:r>
+          </w:p>
+        </w:tc>
+        <w:tc>
+          <w:tcPr>
+            <w:tcW w:w="1555" w:type="dxa"/>
+            <w:vAlign w:val="center"/>
+          </w:tcPr>
+          <w:p>
+            <w:r>
+              <w:t>Ventajas</w:t>
+            </w:r>
+          </w:p>
+        </w:tc>
+        <w:tc>
+          <w:tcPr>
+            <w:tcW w:w="1699" w:type="dxa"/>
+            <w:vAlign w:val="center"/>
+          </w:tcPr>
+          <w:p>
+            <w:r>
+              <w:t>Desventajas</w:t>
+            </w:r>
+          </w:p>
+        </w:tc>
+      </w:tr>
+      <w:tr>
+        <w:trPr>
+          <w:trHeight w:val="1077"/>
+          <w:jc w:val="center"/>
+        </w:trPr>
+        <w:tc>
+          <w:tcPr>
+            <w:tcW w:w="1698" w:type="dxa"/>
+            <w:vAlign w:val="center"/>
+          </w:tcPr>
+          <w:p>
+            <w:r>
+              <w:t>FileZilla</w:t>
+            </w:r>
+          </w:p>
+        </w:tc>
+        <w:tc>
+          <w:tcPr>
+            <w:tcW w:w="1699" w:type="dxa"/>
+            <w:vAlign w:val="center"/>
+          </w:tcPr>
+          <w:p>
+            <w:r>
+              <w:t>Windows</w:t>
+            </w:r>
+          </w:p>
+        </w:tc>
+        <w:tc>
+          <w:tcPr>
+            <w:tcW w:w="1843" w:type="dxa"/>
+            <w:vAlign w:val="center"/>
+          </w:tcPr>
+          <w:p>
+            <w:r>
+              <w:t>FTP, FTPS</w:t>
+            </w:r>
+          </w:p>
+        </w:tc>
+        <w:tc>
+          <w:tcPr>
+            <w:tcW w:w="1555" w:type="dxa"/>
+            <w:vAlign w:val="center"/>
+          </w:tcPr>
+          <w:p>
+            <w:r>
+              <w:t>Gratuito, fácil de usar</w:t>
+            </w:r>
+          </w:p>
+        </w:tc>
+        <w:tc>
+          <w:tcPr>
+            <w:tcW w:w="1699" w:type="dxa"/>
+            <w:vAlign w:val="center"/>
+          </w:tcPr>
+          <w:tbl>
+            <w:tblPr>
+              <w:tblW w:w="0" w:type="auto"/>
+              <w:tblCellSpacing w:w="15" w:type="dxa"/>
+              <w:tblCellMar>
+                <w:top w:w="15" w:type="dxa"/>
+                <w:left w:w="15" w:type="dxa"/>
+                <w:bottom w:w="15" w:type="dxa"/>
+                <w:right w:w="15" w:type="dxa"/>
+              </w:tblCellMar>
+              <w:tblLook w:val="04A0" w:firstRow="1" w:lastRow="0" w:firstColumn="1" w:lastColumn="0" w:noHBand="0" w:noVBand="1"/>
+            </w:tblPr>
+            <w:tblGrid>
+              <w:gridCol w:w="96"/>
+            </w:tblGrid>
+            <w:tr>
+              <w:trPr>
+                <w:tblCellSpacing w:w="15" w:type="dxa"/>
+              </w:trPr>
+              <w:tc>
+                <w:tcPr>
+                  <w:tcW w:w="0" w:type="auto"/>
+                  <w:vAlign w:val="center"/>
+                  <w:hideMark/>
+                </w:tcPr>
+                <w:p>
+                  <w:pPr>
+                    <w:spacing w:after="0" w:line="240" w:lineRule="auto"/>
+                    <w:rPr>
+                      <w:rFonts w:ascii="Times New Roman" w:eastAsia="Times New Roman" w:hAnsi="Times New Roman" w:cs="Times New Roman"/>
+                    </w:rPr>
+                  </w:pPr>
+                </w:p>
+              </w:tc>
+            </w:tr>
+          </w:tbl>
+          <w:p>
+            <w:pPr>
+              <w:rPr>
+                <w:rFonts w:ascii="Times New Roman" w:eastAsia="Times New Roman" w:hAnsi="Times New Roman" w:cs="Times New Roman"/>
+                <w:vanish/>
+              </w:rPr>
+            </w:pPr>
+          </w:p>
+          <w:tbl>
+            <w:tblPr>
+              <w:tblW w:w="0" w:type="auto"/>
+              <w:tblCellSpacing w:w="15" w:type="dxa"/>
+              <w:tblCellMar>
+                <w:top w:w="15" w:type="dxa"/>
+                <w:left w:w="15" w:type="dxa"/>
+                <w:bottom w:w="15" w:type="dxa"/>
+                <w:right w:w="15" w:type="dxa"/>
+              </w:tblCellMar>
+              <w:tblLook w:val="04A0" w:firstRow="1" w:lastRow="0" w:firstColumn="1" w:lastColumn="0" w:noHBand="0" w:noVBand="1"/>
+            </w:tblPr>
+            <w:tblGrid>
+              <w:gridCol w:w="1483"/>
+            </w:tblGrid>
+            <w:tr>
+              <w:trPr>
+                <w:tblCellSpacing w:w="15" w:type="dxa"/>
+              </w:trPr>
+              <w:tc>
+                <w:tcPr>
+                  <w:tcW w:w="0" w:type="auto"/>
+                  <w:vAlign w:val="center"/>
+                  <w:hideMark/>
+                </w:tcPr>
+                <w:p>
+                  <w:pPr>
+                    <w:spacing w:after="0" w:line="240" w:lineRule="auto"/>
+                    <w:rPr>
+                      <w:rFonts w:ascii="Times New Roman" w:eastAsia="Times New Roman" w:hAnsi="Times New Roman" w:cs="Times New Roman"/>
+                    </w:rPr>
+                  </w:pPr>
+                  <w:r>
+                    <w:rPr>
+                      <w:rFonts w:ascii="Times New Roman" w:eastAsia="Times New Roman" w:hAnsi="Times New Roman" w:cs="Times New Roman"/>
+                    </w:rPr>
+                    <w:t>Solo en Windows, básico</w:t>
+                  </w:r>
+                </w:p>
+              </w:tc>
+            </w:tr>
+          </w:tbl>
+          <w:p/>
+        </w:tc>
+      </w:tr>
+      <w:tr>
+        <w:trPr>
+          <w:trHeight w:val="1077"/>
+          <w:jc w:val="center"/>
+        </w:trPr>
+        <w:tc>
+          <w:tcPr>
+            <w:tcW w:w="1698" w:type="dxa"/>
+            <w:vAlign w:val="center"/>
+          </w:tcPr>
+          <w:p>
+            <w:r>
+              <w:t>ProFTPD</w:t>
+            </w:r>
+          </w:p>
+        </w:tc>
+        <w:tc>
+          <w:tcPr>
+            <w:tcW w:w="1699" w:type="dxa"/>
+            <w:vAlign w:val="center"/>
+          </w:tcPr>
+          <w:p>
+            <w:r>
+              <w:t>Linux, Unix</w:t>
+            </w:r>
+          </w:p>
+        </w:tc>
+        <w:tc>
+          <w:tcPr>
+            <w:tcW w:w="1843" w:type="dxa"/>
+            <w:vAlign w:val="center"/>
+          </w:tcPr>
+          <w:tbl>
+            <w:tblPr>
+              <w:tblW w:w="0" w:type="auto"/>
+              <w:tblCellSpacing w:w="15" w:type="dxa"/>
+              <w:tblCellMar>
+                <w:top w:w="15" w:type="dxa"/>
+                <w:left w:w="15" w:type="dxa"/>
+                <w:bottom w:w="15" w:type="dxa"/>
+                <w:right w:w="15" w:type="dxa"/>
+              </w:tblCellMar>
+              <w:tblLook w:val="04A0" w:firstRow="1" w:lastRow="0" w:firstColumn="1" w:lastColumn="0" w:noHBand="0" w:noVBand="1"/>
+            </w:tblPr>
+            <w:tblGrid>
+              <w:gridCol w:w="96"/>
+            </w:tblGrid>
+            <w:tr>
+              <w:trPr>
+                <w:tblCellSpacing w:w="15" w:type="dxa"/>
+              </w:trPr>
+              <w:tc>
+                <w:tcPr>
+                  <w:tcW w:w="0" w:type="auto"/>
+                  <w:vAlign w:val="center"/>
+                  <w:hideMark/>
+                </w:tcPr>
+                <w:p>
+                  <w:pPr>
+                    <w:spacing w:after="0" w:line="240" w:lineRule="auto"/>
+                    <w:rPr>
+                      <w:rFonts w:ascii="Times New Roman" w:eastAsia="Times New Roman" w:hAnsi="Times New Roman" w:cs="Times New Roman"/>
+                    </w:rPr>
+                  </w:pPr>
+                </w:p>
+              </w:tc>
+            </w:tr>
+          </w:tbl>
+          <w:p>
+            <w:pPr>
+              <w:rPr>
+                <w:rFonts w:ascii="Times New Roman" w:eastAsia="Times New Roman" w:hAnsi="Times New Roman" w:cs="Times New Roman"/>
+                <w:vanish/>
+              </w:rPr>
+            </w:pPr>
+          </w:p>
+          <w:tbl>
+            <w:tblPr>
+              <w:tblW w:w="0" w:type="auto"/>
+              <w:tblCellSpacing w:w="15" w:type="dxa"/>
+              <w:tblCellMar>
+                <w:top w:w="15" w:type="dxa"/>
+                <w:left w:w="15" w:type="dxa"/>
+                <w:bottom w:w="15" w:type="dxa"/>
+                <w:right w:w="15" w:type="dxa"/>
+              </w:tblCellMar>
+              <w:tblLook w:val="04A0" w:firstRow="1" w:lastRow="0" w:firstColumn="1" w:lastColumn="0" w:noHBand="0" w:noVBand="1"/>
+            </w:tblPr>
+            <w:tblGrid>
+              <w:gridCol w:w="1627"/>
+            </w:tblGrid>
+            <w:tr>
+              <w:trPr>
+                <w:tblCellSpacing w:w="15" w:type="dxa"/>
+              </w:trPr>
+              <w:tc>
+                <w:tcPr>
+                  <w:tcW w:w="0" w:type="auto"/>
+                  <w:vAlign w:val="center"/>
+                  <w:hideMark/>
+                </w:tcPr>
+                <w:p>
+                  <w:pPr>
+                    <w:spacing w:after="0" w:line="240" w:lineRule="auto"/>
+                    <w:rPr>
+                      <w:rFonts w:ascii="Times New Roman" w:eastAsia="Times New Roman" w:hAnsi="Times New Roman" w:cs="Times New Roman"/>
+                    </w:rPr>
+                  </w:pPr>
+                  <w:r>
+                    <w:rPr>
+                      <w:rFonts w:ascii="Times New Roman" w:eastAsia="Times New Roman" w:hAnsi="Times New Roman" w:cs="Times New Roman"/>
+                    </w:rPr>
+                    <w:t>FTP, FTPS, SFTP</w:t>
+                  </w:r>
+                </w:p>
+              </w:tc>
+            </w:tr>
+          </w:tbl>
+          <w:p/>
+        </w:tc>
+        <w:tc>
+          <w:tcPr>
+            <w:tcW w:w="1555" w:type="dxa"/>
+            <w:vAlign w:val="center"/>
+          </w:tcPr>
+          <w:p>
+            <w:r>
+              <w:t>Altamente configurable</w:t>
+            </w:r>
+          </w:p>
+        </w:tc>
+        <w:tc>
+          <w:tcPr>
+            <w:tcW w:w="1699" w:type="dxa"/>
+            <w:vAlign w:val="center"/>
+          </w:tcPr>
+          <w:tbl>
+            <w:tblPr>
+              <w:tblW w:w="0" w:type="auto"/>
+              <w:tblCellSpacing w:w="15" w:type="dxa"/>
+              <w:tblCellMar>
+                <w:top w:w="15" w:type="dxa"/>
+                <w:left w:w="15" w:type="dxa"/>
+                <w:bottom w:w="15" w:type="dxa"/>
+                <w:right w:w="15" w:type="dxa"/>
+              </w:tblCellMar>
+              <w:tblLook w:val="04A0" w:firstRow="1" w:lastRow="0" w:firstColumn="1" w:lastColumn="0" w:noHBand="0" w:noVBand="1"/>
+            </w:tblPr>
+            <w:tblGrid>
+              <w:gridCol w:w="96"/>
+            </w:tblGrid>
+            <w:tr>
+              <w:trPr>
+                <w:tblCellSpacing w:w="15" w:type="dxa"/>
+              </w:trPr>
+              <w:tc>
+                <w:tcPr>
+                  <w:tcW w:w="0" w:type="auto"/>
+                  <w:vAlign w:val="center"/>
+                  <w:hideMark/>
+                </w:tcPr>
+                <w:p>
+                  <w:pPr>
+                    <w:spacing w:after="0" w:line="240" w:lineRule="auto"/>
+                    <w:rPr>
+                      <w:rFonts w:ascii="Times New Roman" w:eastAsia="Times New Roman" w:hAnsi="Times New Roman" w:cs="Times New Roman"/>
+                    </w:rPr>
+                  </w:pPr>
+                </w:p>
+              </w:tc>
+            </w:tr>
+          </w:tbl>
+          <w:p>
+            <w:pPr>
+              <w:rPr>
+                <w:rFonts w:ascii="Times New Roman" w:eastAsia="Times New Roman" w:hAnsi="Times New Roman" w:cs="Times New Roman"/>
+                <w:vanish/>
+              </w:rPr>
+            </w:pPr>
+          </w:p>
+          <w:tbl>
+            <w:tblPr>
+              <w:tblW w:w="0" w:type="auto"/>
+              <w:tblCellSpacing w:w="15" w:type="dxa"/>
+              <w:tblCellMar>
+                <w:top w:w="15" w:type="dxa"/>
+                <w:left w:w="15" w:type="dxa"/>
+                <w:bottom w:w="15" w:type="dxa"/>
+                <w:right w:w="15" w:type="dxa"/>
+              </w:tblCellMar>
+              <w:tblLook w:val="04A0" w:firstRow="1" w:lastRow="0" w:firstColumn="1" w:lastColumn="0" w:noHBand="0" w:noVBand="1"/>
+            </w:tblPr>
+            <w:tblGrid>
+              <w:gridCol w:w="1483"/>
+            </w:tblGrid>
+            <w:tr>
+              <w:trPr>
+                <w:tblCellSpacing w:w="15" w:type="dxa"/>
+              </w:trPr>
+              <w:tc>
+                <w:tcPr>
+                  <w:tcW w:w="0" w:type="auto"/>
+                  <w:vAlign w:val="center"/>
+                  <w:hideMark/>
+                </w:tcPr>
+                <w:p>
+                  <w:pPr>
+                    <w:spacing w:after="0" w:line="240" w:lineRule="auto"/>
+                    <w:rPr>
+                      <w:rFonts w:ascii="Times New Roman" w:eastAsia="Times New Roman" w:hAnsi="Times New Roman" w:cs="Times New Roman"/>
+                    </w:rPr>
+                  </w:pPr>
+                  <w:r>
+                    <w:rPr>
+                      <w:rFonts w:ascii="Times New Roman" w:eastAsia="Times New Roman" w:hAnsi="Times New Roman" w:cs="Times New Roman"/>
+                    </w:rPr>
+                    <w:t>Configuración compleja</w:t>
+                  </w:r>
+                </w:p>
+              </w:tc>
+            </w:tr>
+          </w:tbl>
+          <w:p/>
+        </w:tc>
+      </w:tr>
+      <w:tr>
+        <w:trPr>
+          <w:trHeight w:val="1077"/>
+          <w:jc w:val="center"/>
+        </w:trPr>
+        <w:tc>
+          <w:tcPr>
+            <w:tcW w:w="1698" w:type="dxa"/>
+            <w:vAlign w:val="center"/>
+          </w:tcPr>
+          <w:p>
+            <w:r>
+              <w:t>vsftpd</w:t>
+            </w:r>
+          </w:p>
+        </w:tc>
+        <w:tc>
+          <w:tcPr>
+            <w:tcW w:w="1699" w:type="dxa"/>
+            <w:vAlign w:val="center"/>
+          </w:tcPr>
+          <w:p>
+            <w:r>
+              <w:t>Linux, Unix</w:t>
+            </w:r>
+          </w:p>
+        </w:tc>
+        <w:tc>
+          <w:tcPr>
+            <w:tcW w:w="1843" w:type="dxa"/>
+            <w:vAlign w:val="center"/>
+          </w:tcPr>
+          <w:p>
+            <w:r>
+              <w:t>FTP, FTPS</w:t>
+            </w:r>
+          </w:p>
+        </w:tc>
+        <w:tc>
+          <w:tcPr>
+            <w:tcW w:w="1555" w:type="dxa"/>
+            <w:vAlign w:val="center"/>
+          </w:tcPr>
+          <w:p>
+            <w:r>
+              <w:t>Muy seguro y estable</w:t>
+            </w:r>
+          </w:p>
+        </w:tc>
+        <w:tc>
+          <w:tcPr>
+            <w:tcW w:w="1699" w:type="dxa"/>
+            <w:vAlign w:val="center"/>
+          </w:tcPr>
+          <w:p>
+            <w:r>
+              <w:t>Difícil de configurar</w:t>
+            </w:r>
+          </w:p>
+        </w:tc>
+      </w:tr>
+      <w:tr>
+        <w:trPr>
+          <w:trHeight w:val="1077"/>
+          <w:jc w:val="center"/>
+        </w:trPr>
+        <w:tc>
+          <w:tcPr>
+            <w:tcW w:w="1698" w:type="dxa"/>
+            <w:vAlign w:val="center"/>
+          </w:tcPr>
+          <w:p>
+            <w:r>
+              <w:t>Pure-FTPd</w:t>
+            </w:r>
+          </w:p>
+        </w:tc>
+        <w:tc>
+          <w:tcPr>
+            <w:tcW w:w="1699" w:type="dxa"/>
+            <w:vAlign w:val="center"/>
+          </w:tcPr>
+          <w:p>
+            <w:r>
+              <w:t>Linux, Unix</w:t>
+            </w:r>
+          </w:p>
+        </w:tc>
+        <w:tc>
+          <w:tcPr>
+            <w:tcW w:w="1843" w:type="dxa"/>
+            <w:vAlign w:val="center"/>
+          </w:tcPr>
+          <w:tbl>
+            <w:tblPr>
+              <w:tblW w:w="0" w:type="auto"/>
+              <w:tblCellSpacing w:w="15" w:type="dxa"/>
+              <w:tblCellMar>
+                <w:top w:w="15" w:type="dxa"/>
+                <w:left w:w="15" w:type="dxa"/>
+                <w:bottom w:w="15" w:type="dxa"/>
+                <w:right w:w="15" w:type="dxa"/>
+              </w:tblCellMar>
+              <w:tblLook w:val="04A0" w:firstRow="1" w:lastRow="0" w:firstColumn="1" w:lastColumn="0" w:noHBand="0" w:noVBand="1"/>
+            </w:tblPr>
+            <w:tblGrid>
+              <w:gridCol w:w="96"/>
+            </w:tblGrid>
+            <w:tr>
+              <w:trPr>
+                <w:tblCellSpacing w:w="15" w:type="dxa"/>
+              </w:trPr>
+              <w:tc>
+                <w:tcPr>
+                  <w:tcW w:w="0" w:type="auto"/>
+                  <w:vAlign w:val="center"/>
+                  <w:hideMark/>
+                </w:tcPr>
+                <w:p>
+                  <w:pPr>
+                    <w:spacing w:after="0" w:line="240" w:lineRule="auto"/>
+                    <w:rPr>
+                      <w:rFonts w:ascii="Times New Roman" w:eastAsia="Times New Roman" w:hAnsi="Times New Roman" w:cs="Times New Roman"/>
+                    </w:rPr>
+                  </w:pPr>
+                </w:p>
+              </w:tc>
+            </w:tr>
+          </w:tbl>
+          <w:p>
+            <w:pPr>
+              <w:rPr>
+                <w:rFonts w:ascii="Times New Roman" w:eastAsia="Times New Roman" w:hAnsi="Times New Roman" w:cs="Times New Roman"/>
+                <w:vanish/>
+              </w:rPr>
+            </w:pPr>
+          </w:p>
+          <w:tbl>
+            <w:tblPr>
+              <w:tblW w:w="0" w:type="auto"/>
+              <w:tblCellSpacing w:w="15" w:type="dxa"/>
+              <w:tblCellMar>
+                <w:top w:w="15" w:type="dxa"/>
+                <w:left w:w="15" w:type="dxa"/>
+                <w:bottom w:w="15" w:type="dxa"/>
+                <w:right w:w="15" w:type="dxa"/>
+              </w:tblCellMar>
+              <w:tblLook w:val="04A0" w:firstRow="1" w:lastRow="0" w:firstColumn="1" w:lastColumn="0" w:noHBand="0" w:noVBand="1"/>
+            </w:tblPr>
+            <w:tblGrid>
+              <w:gridCol w:w="1627"/>
+            </w:tblGrid>
+            <w:tr>
+              <w:trPr>
+                <w:tblCellSpacing w:w="15" w:type="dxa"/>
+              </w:trPr>
+              <w:tc>
+                <w:tcPr>
+                  <w:tcW w:w="0" w:type="auto"/>
+                  <w:vAlign w:val="center"/>
+                  <w:hideMark/>
+                </w:tcPr>
+                <w:p>
+                  <w:pPr>
+                    <w:spacing w:after="0" w:line="240" w:lineRule="auto"/>
+                    <w:rPr>
+                      <w:rFonts w:ascii="Times New Roman" w:eastAsia="Times New Roman" w:hAnsi="Times New Roman" w:cs="Times New Roman"/>
+                    </w:rPr>
+                  </w:pPr>
+                  <w:r>
+                    <w:rPr>
+                      <w:rFonts w:ascii="Times New Roman" w:eastAsia="Times New Roman" w:hAnsi="Times New Roman" w:cs="Times New Roman"/>
+                    </w:rPr>
+                    <w:t>FTP, FTPS, SFTP</w:t>
+                  </w:r>
+                </w:p>
+              </w:tc>
+            </w:tr>
+          </w:tbl>
+          <w:p/>
+        </w:tc>
+        <w:tc>
+          <w:tcPr>
+            <w:tcW w:w="1555" w:type="dxa"/>
+            <w:vAlign w:val="center"/>
+          </w:tcPr>
+          <w:p>
+            <w:r>
+              <w:t>Seguridad avanzada, fácil de usar</w:t>
+            </w:r>
+          </w:p>
+        </w:tc>
+        <w:tc>
+          <w:tcPr>
+            <w:tcW w:w="1699" w:type="dxa"/>
+            <w:vAlign w:val="center"/>
+          </w:tcPr>
+          <w:p>
+            <w:r>
+              <w:t>Sin interfaz gráfica</w:t>
+            </w:r>
+          </w:p>
+        </w:tc>
+      </w:tr>
+      <w:tr>
+        <w:trPr>
+          <w:trHeight w:val="1077"/>
+          <w:jc w:val="center"/>
+        </w:trPr>
+        <w:tc>
+          <w:tcPr>
+            <w:tcW w:w="1698" w:type="dxa"/>
+            <w:vAlign w:val="center"/>
+          </w:tcPr>
+          <w:p>
+            <w:r>
+              <w:t>Serv-U</w:t>
+            </w:r>
+          </w:p>
+        </w:tc>
+        <w:tc>
+          <w:tcPr>
+            <w:tcW w:w="1699" w:type="dxa"/>
+            <w:vAlign w:val="center"/>
+          </w:tcPr>
+          <w:p>
+            <w:r>
+              <w:t>Windows</w:t>
+            </w:r>
+          </w:p>
+        </w:tc>
+        <w:tc>
+          <w:tcPr>
+            <w:tcW w:w="1843" w:type="dxa"/>
+            <w:vAlign w:val="center"/>
+          </w:tcPr>
+          <w:tbl>
+            <w:tblPr>
+              <w:tblW w:w="0" w:type="auto"/>
+              <w:tblCellSpacing w:w="15" w:type="dxa"/>
+              <w:tblCellMar>
+                <w:top w:w="15" w:type="dxa"/>
+                <w:left w:w="15" w:type="dxa"/>
+                <w:bottom w:w="15" w:type="dxa"/>
+                <w:right w:w="15" w:type="dxa"/>
+              </w:tblCellMar>
+              <w:tblLook w:val="04A0" w:firstRow="1" w:lastRow="0" w:firstColumn="1" w:lastColumn="0" w:noHBand="0" w:noVBand="1"/>
+            </w:tblPr>
+            <w:tblGrid>
+              <w:gridCol w:w="96"/>
+            </w:tblGrid>
+            <w:tr>
+              <w:trPr>
+                <w:tblCellSpacing w:w="15" w:type="dxa"/>
+              </w:trPr>
+              <w:tc>
+                <w:tcPr>
+                  <w:tcW w:w="0" w:type="auto"/>
+                  <w:vAlign w:val="center"/>
+                  <w:hideMark/>
+                </w:tcPr>
+                <w:p>
+                  <w:pPr>
+                    <w:spacing w:after="0" w:line="240" w:lineRule="auto"/>
+                    <w:rPr>
+                      <w:rFonts w:ascii="Times New Roman" w:eastAsia="Times New Roman" w:hAnsi="Times New Roman" w:cs="Times New Roman"/>
+                    </w:rPr>
+                  </w:pPr>
+                </w:p>
+              </w:tc>
+            </w:tr>
+          </w:tbl>
+          <w:p>
+            <w:pPr>
+              <w:rPr>
+                <w:rFonts w:ascii="Times New Roman" w:eastAsia="Times New Roman" w:hAnsi="Times New Roman" w:cs="Times New Roman"/>
+                <w:vanish/>
+              </w:rPr>
+            </w:pPr>
+          </w:p>
+          <w:tbl>
+            <w:tblPr>
+              <w:tblW w:w="0" w:type="auto"/>
+              <w:tblCellSpacing w:w="15" w:type="dxa"/>
+              <w:tblCellMar>
+                <w:top w:w="15" w:type="dxa"/>
+                <w:left w:w="15" w:type="dxa"/>
+                <w:bottom w:w="15" w:type="dxa"/>
+                <w:right w:w="15" w:type="dxa"/>
+              </w:tblCellMar>
+              <w:tblLook w:val="04A0" w:firstRow="1" w:lastRow="0" w:firstColumn="1" w:lastColumn="0" w:noHBand="0" w:noVBand="1"/>
+            </w:tblPr>
+            <w:tblGrid>
+              <w:gridCol w:w="1627"/>
+            </w:tblGrid>
+            <w:tr>
+              <w:trPr>
+                <w:tblCellSpacing w:w="15" w:type="dxa"/>
+              </w:trPr>
+              <w:tc>
+                <w:tcPr>
+                  <w:tcW w:w="0" w:type="auto"/>
+                  <w:vAlign w:val="center"/>
+                  <w:hideMark/>
+                </w:tcPr>
+                <w:p>
+                  <w:pPr>
+                    <w:spacing w:after="0" w:line="240" w:lineRule="auto"/>
+                    <w:rPr>
+                      <w:rFonts w:ascii="Times New Roman" w:eastAsia="Times New Roman" w:hAnsi="Times New Roman" w:cs="Times New Roman"/>
+                    </w:rPr>
+                  </w:pPr>
+                  <w:r>
+                    <w:rPr>
+                      <w:rFonts w:ascii="Times New Roman" w:eastAsia="Times New Roman" w:hAnsi="Times New Roman" w:cs="Times New Roman"/>
+                    </w:rPr>
+                    <w:t>FTP, FTPS, SFTP</w:t>
+                  </w:r>
+                </w:p>
+              </w:tc>
+            </w:tr>
+          </w:tbl>
+          <w:p/>
+        </w:tc>
+        <w:tc>
+          <w:tcPr>
+            <w:tcW w:w="1555" w:type="dxa"/>
+            <w:vAlign w:val="center"/>
+          </w:tcPr>
+          <w:p>
+            <w:r>
+              <w:t>Gestión avanzada y segura</w:t>
+            </w:r>
+          </w:p>
+        </w:tc>
+        <w:tc>
+          <w:tcPr>
+            <w:tcW w:w="1699" w:type="dxa"/>
+            <w:vAlign w:val="center"/>
+          </w:tcPr>
+          <w:p>
+            <w:r>
+              <w:t>Propietario y costoso</w:t>
+            </w:r>
+          </w:p>
+        </w:tc>
+      </w:tr>
+    </w:tbl>
+    <w:p/>
     <w:p>
       <w:pPr>
         <w:pStyle w:val="Ttulo2"/>
       </w:pPr>
       <w:r>
+        <w:t>¿Qué son los RFCs?</w:t>
+      </w:r>
+    </w:p>
+    <w:p>
+      <w:r>
+        <w:t>Los RFCs (Request for Comments) son</w:t>
+      </w:r>
+      <w:r>
+        <w:t xml:space="preserve"> una seria </w:t>
+      </w:r>
+      <w:r>
+        <w:t>de documentación</w:t>
+      </w:r>
+      <w:r>
+        <w:t xml:space="preserve"> en </w:t>
+      </w:r>
+      <w:r>
+        <w:t>la que</w:t>
+      </w:r>
+      <w:r>
+        <w:t xml:space="preserve"> se</w:t>
+      </w:r>
+      <w:r>
+        <w:t xml:space="preserve"> establecen </w:t>
+      </w:r>
+      <w:r>
+        <w:t xml:space="preserve">los </w:t>
+      </w:r>
+      <w:r>
+        <w:t xml:space="preserve">estándares y guías técnicas para internet y redes. Son publicados por la IETF y otros organismos. </w:t>
+      </w:r>
+    </w:p>
+    <w:p/>
+    <w:p>
+      <w:pPr>
+        <w:pStyle w:val="Ttulo2"/>
+      </w:pPr>
+      <w:r>
         <w:t>¿Qué ventajas ofrece el modo activo en FTP?</w:t>
       </w:r>
     </w:p>
     <w:p>
+      <w:r>
+        <w:t xml:space="preserve">La configuración del servidor se simplifica con </w:t>
+      </w:r>
+      <w:r>
+        <w:t xml:space="preserve">el </w:t>
+      </w:r>
+      <w:r>
+        <w:t>modo</w:t>
+      </w:r>
+      <w:r>
+        <w:t xml:space="preserve"> </w:t>
+      </w:r>
+      <w:r>
+        <w:t>activo</w:t>
+      </w:r>
+      <w:r>
+        <w:t xml:space="preserve"> </w:t>
+      </w:r>
+      <w:r>
+        <w:t>en</w:t>
+      </w:r>
+      <w:r>
+        <w:t xml:space="preserve"> FTP, ya que la conexión de datos es iniciada por el cliente, disminuyendo la carga en el servidor. Funciona mejor con servidores antiguos y necesita menos configuración de puertos. Se desempeña adecuadamente en entornos de red sin limitaciones de firewall en el lado del cliente. No obstante, es posible enfrentar problemas con firewalls y NAT que impiden las conexiones que entran.</w:t>
+      </w:r>
+    </w:p>
+    <w:p/>
+    <w:p>
       <w:pPr>
         <w:pStyle w:val="Ttulo1"/>
       </w:pPr>
       <w:r>
+        <w:lastRenderedPageBreak/>
         <w:t>Reflexión personal</w:t>
       </w:r>
     </w:p>
@@ -2281,32 +3041,89 @@
       <w:pPr>
         <w:pStyle w:val="Ttulo1"/>
         <w:rPr>
-          <w:sz w:val="28"/>
-          <w:szCs w:val="28"/>
-        </w:rPr>
-      </w:pPr>
-      <w:r>
-        <w:rPr>
           <w:rStyle w:val="Ttulo2Car"/>
         </w:rPr>
+      </w:pPr>
+      <w:r>
+        <w:rPr>
+          <w:rStyle w:val="Ttulo2Car"/>
+        </w:rPr>
         <w:t>¿Qué mecanismos de transferencia de archivos has utilizado? Cuenta tu experiencia.</w:t>
+      </w:r>
+    </w:p>
+    <w:p>
+      <w:pPr>
+        <w:rPr>
+          <w:rStyle w:val="Ttulo2Car"/>
+        </w:rPr>
+      </w:pPr>
+      <w:r>
+        <w:rPr>
+          <w:rFonts w:asciiTheme="minorHAnsi" w:hAnsiTheme="minorHAnsi" w:cs="Arial"/>
+          <w:color w:val="000000"/>
+        </w:rPr>
+        <w:t xml:space="preserve">De todos, el que más uso le he dado se podría decir que ha sido </w:t>
+      </w:r>
+      <w:r>
+        <w:rPr>
+          <w:rStyle w:val="Textoennegrita"/>
+          <w:rFonts w:asciiTheme="minorHAnsi" w:hAnsiTheme="minorHAnsi" w:cs="Arial"/>
+        </w:rPr>
+        <w:t>P2P</w:t>
+      </w:r>
+      <w:r>
+        <w:rPr>
+          <w:rStyle w:val="Textoennegrita"/>
+          <w:rFonts w:asciiTheme="minorHAnsi" w:hAnsiTheme="minorHAnsi"/>
+        </w:rPr>
+        <w:t xml:space="preserve"> </w:t>
+      </w:r>
+      <w:r>
+        <w:rPr>
+          <w:rFonts w:asciiTheme="minorHAnsi" w:hAnsiTheme="minorHAnsi" w:cs="Arial"/>
+          <w:color w:val="000000"/>
+        </w:rPr>
+        <w:t>mediante aplicaciones como uTorrent o qbTorrent para la descarga de archivos de gran tamaño y el FTPS para la descarga de archivos de internet.</w:t>
       </w:r>
       <w:r>
         <w:rPr>
           <w:rFonts w:ascii="Arial" w:hAnsi="Arial" w:cs="Arial"/>
           <w:color w:val="000000"/>
+        </w:rPr>
+        <w:br/>
+      </w:r>
+      <w:r>
+        <w:rPr>
+          <w:rStyle w:val="Ttulo2Car"/>
+        </w:rPr>
+        <w:t>¿Qué utilidad crees que puede tener para los desarrolladores que tu servidor web sea también servidor FTP? ¿Y para los usuarios?</w:t>
+      </w:r>
+    </w:p>
+    <w:p>
+      <w:pPr>
+        <w:pStyle w:val="Sinespaciado"/>
+        <w:rPr>
+          <w:rStyle w:val="Ttulo2Car"/>
+          <w:rFonts w:asciiTheme="minorHAnsi" w:eastAsiaTheme="minorEastAsia" w:hAnsiTheme="minorHAnsi" w:cs="Arial"/>
+          <w:i w:val="0"/>
+          <w:color w:val="auto"/>
           <w:sz w:val="22"/>
           <w:szCs w:val="22"/>
         </w:rPr>
-        <w:br/>
-      </w:r>
+      </w:pPr>
       <w:r>
         <w:rPr>
           <w:rStyle w:val="Ttulo2Car"/>
-        </w:rPr>
-        <w:t>¿Qué utilidad crees que puede tener para los desarrolladores que tu servidor web sea también servidor FTP? ¿Y para los usuarios?</w:t>
-      </w:r>
-    </w:p>
+          <w:rFonts w:asciiTheme="minorHAnsi" w:eastAsiaTheme="minorEastAsia" w:hAnsiTheme="minorHAnsi" w:cs="Arial"/>
+          <w:i w:val="0"/>
+          <w:color w:val="auto"/>
+          <w:sz w:val="22"/>
+          <w:szCs w:val="22"/>
+        </w:rPr>
+        <w:t>Contar con un servidor web que cumpla la función de servidor FTP resulta conveniente para los desarrolladores, ya que simplifica el despliegue y la administración ágil de archivos, posibilita la inclusión de herramientas de desarrollo y la gestión de usuarios y permisos. Proporciona a los usuarios una manera fácil de cargar contenido y obtener acceso a archivos de forma remota, lo que facilita la actualización y administración de recursos sin complicaciones.</w:t>
+      </w:r>
+    </w:p>
+    <w:p/>
     <w:p>
       <w:pPr>
         <w:ind w:left="720"/>
@@ -2804,7 +3621,7 @@
   <w:abstractNum w:abstractNumId="4" w15:restartNumberingAfterBreak="0">
     <w:nsid w:val="5BED6F3E"/>
     <w:multiLevelType w:val="hybridMultilevel"/>
-    <w:tmpl w:val="68A4BD98"/>
+    <w:tmpl w:val="03CE6108"/>
     <w:lvl w:ilvl="0" w:tplc="0C0A0001">
       <w:start w:val="1"/>
       <w:numFmt w:val="bullet"/>
@@ -3604,6 +4421,36 @@
       <w:szCs w:val="48"/>
     </w:rPr>
   </w:style>
+  <w:style w:type="table" w:styleId="Tablaconcuadrcula">
+    <w:name w:val="Table Grid"/>
+    <w:basedOn w:val="Tablanormal"/>
+    <w:uiPriority w:val="39"/>
+    <w:rsid w:val="0094005C"/>
+    <w:pPr>
+      <w:spacing w:after="0" w:line="240" w:lineRule="auto"/>
+    </w:pPr>
+    <w:tblPr>
+      <w:tblBorders>
+        <w:top w:val="single" w:sz="4" w:space="0" w:color="auto"/>
+        <w:left w:val="single" w:sz="4" w:space="0" w:color="auto"/>
+        <w:bottom w:val="single" w:sz="4" w:space="0" w:color="auto"/>
+        <w:right w:val="single" w:sz="4" w:space="0" w:color="auto"/>
+        <w:insideH w:val="single" w:sz="4" w:space="0" w:color="auto"/>
+        <w:insideV w:val="single" w:sz="4" w:space="0" w:color="auto"/>
+      </w:tblBorders>
+    </w:tblPr>
+  </w:style>
+  <w:style w:type="character" w:styleId="Textoennegrita">
+    <w:name w:val="Strong"/>
+    <w:basedOn w:val="Fuentedeprrafopredeter"/>
+    <w:uiPriority w:val="22"/>
+    <w:qFormat/>
+    <w:rsid w:val="002E28DC"/>
+    <w:rPr>
+      <w:b/>
+      <w:bCs/>
+    </w:rPr>
+  </w:style>
 </w:styles>
 </file>
 

</xml_diff>

<commit_message>
david indice y migue angele ejercicios faltan pocos revisar lo del for
</commit_message>
<xml_diff>
--- a/DAW/Portafolios-3-RicardoSorinAlmajan (1).docx
+++ b/DAW/Portafolios-3-RicardoSorinAlmajan (1).docx
@@ -137,7 +137,7 @@
                               <a:avLst/>
                             </a:prstGeom>
                             <a:blipFill rotWithShape="1">
-                              <a:blip r:embed="rId6">
+                              <a:blip r:embed="rId7">
                                 <a:alphaModFix/>
                               </a:blip>
                               <a:stretch>
@@ -189,7 +189,7 @@
                     <v:path arrowok="t" o:extrusionok="f"/>
                   </v:shape>
                   <v:rect id="Rectángulo 4" o:spid="_x0000_s1030" style="position:absolute;width:73152;height:12161;visibility:visible;mso-wrap-style:square;v-text-anchor:middle" o:gfxdata="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" stroked="f">
-                    <v:fill r:id="rId7" o:title="" recolor="t" rotate="t" type="frame"/>
+                    <v:fill r:id="rId8" o:title="" recolor="t" rotate="t" type="frame"/>
                     <v:textbox inset="2.53958mm,2.53958mm,2.53958mm,2.53958mm">
                       <w:txbxContent>
                         <w:p>
@@ -555,11 +555,2199 @@
       <w:pPr>
         <w:pStyle w:val="Ttulo1"/>
       </w:pPr>
+      <w:bookmarkStart w:id="0" w:name="_Toc179213718"/>
       <w:r>
         <w:lastRenderedPageBreak/>
         <w:t>Índice:</w:t>
       </w:r>
-    </w:p>
+      <w:bookmarkEnd w:id="0"/>
+    </w:p>
+    <w:sdt>
+      <w:sdtPr>
+        <w:id w:val="1748698626"/>
+        <w:docPartObj>
+          <w:docPartGallery w:val="Table of Contents"/>
+          <w:docPartUnique/>
+        </w:docPartObj>
+      </w:sdtPr>
+      <w:sdtEndPr>
+        <w:rPr>
+          <w:rFonts w:ascii="Calibri" w:eastAsia="Calibri" w:hAnsi="Calibri" w:cs="Calibri"/>
+          <w:b/>
+          <w:bCs/>
+          <w:color w:val="auto"/>
+          <w:sz w:val="22"/>
+          <w:szCs w:val="22"/>
+        </w:rPr>
+      </w:sdtEndPr>
+      <w:sdtContent>
+        <w:p>
+          <w:pPr>
+            <w:pStyle w:val="TtuloTDC"/>
+          </w:pPr>
+          <w:r>
+            <w:t>Contenido</w:t>
+          </w:r>
+        </w:p>
+        <w:p>
+          <w:pPr>
+            <w:pStyle w:val="TDC1"/>
+            <w:tabs>
+              <w:tab w:val="right" w:leader="dot" w:pos="8494"/>
+            </w:tabs>
+            <w:rPr>
+              <w:noProof/>
+            </w:rPr>
+          </w:pPr>
+          <w:r>
+            <w:fldChar w:fldCharType="begin"/>
+          </w:r>
+          <w:r>
+            <w:instrText xml:space="preserve"> TOC \o "1-3" \h \z \u </w:instrText>
+          </w:r>
+          <w:r>
+            <w:fldChar w:fldCharType="separate"/>
+          </w:r>
+          <w:hyperlink w:anchor="_Toc179213718" w:history="1">
+            <w:r>
+              <w:rPr>
+                <w:rStyle w:val="Hipervnculo"/>
+                <w:noProof/>
+              </w:rPr>
+              <w:t>Índice:</w:t>
+            </w:r>
+            <w:r>
+              <w:rPr>
+                <w:noProof/>
+                <w:webHidden/>
+              </w:rPr>
+              <w:tab/>
+            </w:r>
+            <w:r>
+              <w:rPr>
+                <w:noProof/>
+                <w:webHidden/>
+              </w:rPr>
+              <w:fldChar w:fldCharType="begin"/>
+            </w:r>
+            <w:r>
+              <w:rPr>
+                <w:noProof/>
+                <w:webHidden/>
+              </w:rPr>
+              <w:instrText xml:space="preserve"> PAGEREF _Toc179213718 \h </w:instrText>
+            </w:r>
+            <w:r>
+              <w:rPr>
+                <w:noProof/>
+                <w:webHidden/>
+              </w:rPr>
+            </w:r>
+            <w:r>
+              <w:rPr>
+                <w:noProof/>
+                <w:webHidden/>
+              </w:rPr>
+              <w:fldChar w:fldCharType="separate"/>
+            </w:r>
+            <w:r>
+              <w:rPr>
+                <w:noProof/>
+                <w:webHidden/>
+              </w:rPr>
+              <w:t>1</w:t>
+            </w:r>
+            <w:r>
+              <w:rPr>
+                <w:noProof/>
+                <w:webHidden/>
+              </w:rPr>
+              <w:fldChar w:fldCharType="end"/>
+            </w:r>
+          </w:hyperlink>
+        </w:p>
+        <w:p>
+          <w:pPr>
+            <w:pStyle w:val="TDC1"/>
+            <w:tabs>
+              <w:tab w:val="right" w:leader="dot" w:pos="8494"/>
+            </w:tabs>
+            <w:rPr>
+              <w:noProof/>
+            </w:rPr>
+          </w:pPr>
+          <w:hyperlink w:anchor="_Toc179213719" w:history="1">
+            <w:r>
+              <w:rPr>
+                <w:rStyle w:val="Hipervnculo"/>
+                <w:noProof/>
+              </w:rPr>
+              <w:t>Resumen:</w:t>
+            </w:r>
+            <w:r>
+              <w:rPr>
+                <w:noProof/>
+                <w:webHidden/>
+              </w:rPr>
+              <w:tab/>
+            </w:r>
+            <w:r>
+              <w:rPr>
+                <w:noProof/>
+                <w:webHidden/>
+              </w:rPr>
+              <w:fldChar w:fldCharType="begin"/>
+            </w:r>
+            <w:r>
+              <w:rPr>
+                <w:noProof/>
+                <w:webHidden/>
+              </w:rPr>
+              <w:instrText xml:space="preserve"> PAGEREF _Toc179213719 \h </w:instrText>
+            </w:r>
+            <w:r>
+              <w:rPr>
+                <w:noProof/>
+                <w:webHidden/>
+              </w:rPr>
+            </w:r>
+            <w:r>
+              <w:rPr>
+                <w:noProof/>
+                <w:webHidden/>
+              </w:rPr>
+              <w:fldChar w:fldCharType="separate"/>
+            </w:r>
+            <w:r>
+              <w:rPr>
+                <w:noProof/>
+                <w:webHidden/>
+              </w:rPr>
+              <w:t>2</w:t>
+            </w:r>
+            <w:r>
+              <w:rPr>
+                <w:noProof/>
+                <w:webHidden/>
+              </w:rPr>
+              <w:fldChar w:fldCharType="end"/>
+            </w:r>
+          </w:hyperlink>
+        </w:p>
+        <w:p>
+          <w:pPr>
+            <w:pStyle w:val="TDC2"/>
+            <w:tabs>
+              <w:tab w:val="right" w:leader="dot" w:pos="8494"/>
+            </w:tabs>
+            <w:rPr>
+              <w:noProof/>
+            </w:rPr>
+          </w:pPr>
+          <w:hyperlink w:anchor="_Toc179213720" w:history="1">
+            <w:r>
+              <w:rPr>
+                <w:rStyle w:val="Hipervnculo"/>
+                <w:noProof/>
+              </w:rPr>
+              <w:t>Servicios de transferencia:</w:t>
+            </w:r>
+            <w:r>
+              <w:rPr>
+                <w:noProof/>
+                <w:webHidden/>
+              </w:rPr>
+              <w:tab/>
+            </w:r>
+            <w:r>
+              <w:rPr>
+                <w:noProof/>
+                <w:webHidden/>
+              </w:rPr>
+              <w:fldChar w:fldCharType="begin"/>
+            </w:r>
+            <w:r>
+              <w:rPr>
+                <w:noProof/>
+                <w:webHidden/>
+              </w:rPr>
+              <w:instrText xml:space="preserve"> PAGEREF _Toc179213720 \h </w:instrText>
+            </w:r>
+            <w:r>
+              <w:rPr>
+                <w:noProof/>
+                <w:webHidden/>
+              </w:rPr>
+            </w:r>
+            <w:r>
+              <w:rPr>
+                <w:noProof/>
+                <w:webHidden/>
+              </w:rPr>
+              <w:fldChar w:fldCharType="separate"/>
+            </w:r>
+            <w:r>
+              <w:rPr>
+                <w:noProof/>
+                <w:webHidden/>
+              </w:rPr>
+              <w:t>2</w:t>
+            </w:r>
+            <w:r>
+              <w:rPr>
+                <w:noProof/>
+                <w:webHidden/>
+              </w:rPr>
+              <w:fldChar w:fldCharType="end"/>
+            </w:r>
+          </w:hyperlink>
+        </w:p>
+        <w:p>
+          <w:pPr>
+            <w:pStyle w:val="TDC2"/>
+            <w:tabs>
+              <w:tab w:val="right" w:leader="dot" w:pos="8494"/>
+            </w:tabs>
+            <w:rPr>
+              <w:noProof/>
+            </w:rPr>
+          </w:pPr>
+          <w:hyperlink w:anchor="_Toc179213721" w:history="1">
+            <w:r>
+              <w:rPr>
+                <w:rStyle w:val="Hipervnculo"/>
+                <w:noProof/>
+              </w:rPr>
+              <w:t>FTP- Características:</w:t>
+            </w:r>
+            <w:r>
+              <w:rPr>
+                <w:noProof/>
+                <w:webHidden/>
+              </w:rPr>
+              <w:tab/>
+            </w:r>
+            <w:r>
+              <w:rPr>
+                <w:noProof/>
+                <w:webHidden/>
+              </w:rPr>
+              <w:fldChar w:fldCharType="begin"/>
+            </w:r>
+            <w:r>
+              <w:rPr>
+                <w:noProof/>
+                <w:webHidden/>
+              </w:rPr>
+              <w:instrText xml:space="preserve"> PAGEREF _Toc179213721 \h </w:instrText>
+            </w:r>
+            <w:r>
+              <w:rPr>
+                <w:noProof/>
+                <w:webHidden/>
+              </w:rPr>
+            </w:r>
+            <w:r>
+              <w:rPr>
+                <w:noProof/>
+                <w:webHidden/>
+              </w:rPr>
+              <w:fldChar w:fldCharType="separate"/>
+            </w:r>
+            <w:r>
+              <w:rPr>
+                <w:noProof/>
+                <w:webHidden/>
+              </w:rPr>
+              <w:t>2</w:t>
+            </w:r>
+            <w:r>
+              <w:rPr>
+                <w:noProof/>
+                <w:webHidden/>
+              </w:rPr>
+              <w:fldChar w:fldCharType="end"/>
+            </w:r>
+          </w:hyperlink>
+        </w:p>
+        <w:p>
+          <w:pPr>
+            <w:pStyle w:val="TDC2"/>
+            <w:tabs>
+              <w:tab w:val="right" w:leader="dot" w:pos="8494"/>
+            </w:tabs>
+            <w:rPr>
+              <w:noProof/>
+            </w:rPr>
+          </w:pPr>
+          <w:hyperlink w:anchor="_Toc179213722" w:history="1">
+            <w:r>
+              <w:rPr>
+                <w:rStyle w:val="Hipervnculo"/>
+                <w:noProof/>
+              </w:rPr>
+              <w:t>Componentes:</w:t>
+            </w:r>
+            <w:r>
+              <w:rPr>
+                <w:noProof/>
+                <w:webHidden/>
+              </w:rPr>
+              <w:tab/>
+            </w:r>
+            <w:r>
+              <w:rPr>
+                <w:noProof/>
+                <w:webHidden/>
+              </w:rPr>
+              <w:fldChar w:fldCharType="begin"/>
+            </w:r>
+            <w:r>
+              <w:rPr>
+                <w:noProof/>
+                <w:webHidden/>
+              </w:rPr>
+              <w:instrText xml:space="preserve"> PAGEREF _Toc179213722 \h </w:instrText>
+            </w:r>
+            <w:r>
+              <w:rPr>
+                <w:noProof/>
+                <w:webHidden/>
+              </w:rPr>
+            </w:r>
+            <w:r>
+              <w:rPr>
+                <w:noProof/>
+                <w:webHidden/>
+              </w:rPr>
+              <w:fldChar w:fldCharType="separate"/>
+            </w:r>
+            <w:r>
+              <w:rPr>
+                <w:noProof/>
+                <w:webHidden/>
+              </w:rPr>
+              <w:t>2</w:t>
+            </w:r>
+            <w:r>
+              <w:rPr>
+                <w:noProof/>
+                <w:webHidden/>
+              </w:rPr>
+              <w:fldChar w:fldCharType="end"/>
+            </w:r>
+          </w:hyperlink>
+        </w:p>
+        <w:p>
+          <w:pPr>
+            <w:pStyle w:val="TDC2"/>
+            <w:tabs>
+              <w:tab w:val="right" w:leader="dot" w:pos="8494"/>
+            </w:tabs>
+            <w:rPr>
+              <w:noProof/>
+            </w:rPr>
+          </w:pPr>
+          <w:hyperlink w:anchor="_Toc179213723" w:history="1">
+            <w:r>
+              <w:rPr>
+                <w:rStyle w:val="Hipervnculo"/>
+                <w:noProof/>
+              </w:rPr>
+              <w:t>Servidores:</w:t>
+            </w:r>
+            <w:r>
+              <w:rPr>
+                <w:noProof/>
+                <w:webHidden/>
+              </w:rPr>
+              <w:tab/>
+            </w:r>
+            <w:r>
+              <w:rPr>
+                <w:noProof/>
+                <w:webHidden/>
+              </w:rPr>
+              <w:fldChar w:fldCharType="begin"/>
+            </w:r>
+            <w:r>
+              <w:rPr>
+                <w:noProof/>
+                <w:webHidden/>
+              </w:rPr>
+              <w:instrText xml:space="preserve"> PAGEREF _Toc179213723 \h </w:instrText>
+            </w:r>
+            <w:r>
+              <w:rPr>
+                <w:noProof/>
+                <w:webHidden/>
+              </w:rPr>
+            </w:r>
+            <w:r>
+              <w:rPr>
+                <w:noProof/>
+                <w:webHidden/>
+              </w:rPr>
+              <w:fldChar w:fldCharType="separate"/>
+            </w:r>
+            <w:r>
+              <w:rPr>
+                <w:noProof/>
+                <w:webHidden/>
+              </w:rPr>
+              <w:t>2</w:t>
+            </w:r>
+            <w:r>
+              <w:rPr>
+                <w:noProof/>
+                <w:webHidden/>
+              </w:rPr>
+              <w:fldChar w:fldCharType="end"/>
+            </w:r>
+          </w:hyperlink>
+        </w:p>
+        <w:p>
+          <w:pPr>
+            <w:pStyle w:val="TDC2"/>
+            <w:tabs>
+              <w:tab w:val="right" w:leader="dot" w:pos="8494"/>
+            </w:tabs>
+            <w:rPr>
+              <w:noProof/>
+            </w:rPr>
+          </w:pPr>
+          <w:hyperlink w:anchor="_Toc179213724" w:history="1">
+            <w:r>
+              <w:rPr>
+                <w:rStyle w:val="Hipervnculo"/>
+                <w:noProof/>
+              </w:rPr>
+              <w:t>Clientes FTP:</w:t>
+            </w:r>
+            <w:r>
+              <w:rPr>
+                <w:noProof/>
+                <w:webHidden/>
+              </w:rPr>
+              <w:tab/>
+            </w:r>
+            <w:r>
+              <w:rPr>
+                <w:noProof/>
+                <w:webHidden/>
+              </w:rPr>
+              <w:fldChar w:fldCharType="begin"/>
+            </w:r>
+            <w:r>
+              <w:rPr>
+                <w:noProof/>
+                <w:webHidden/>
+              </w:rPr>
+              <w:instrText xml:space="preserve"> PAGEREF _Toc179213724 \h </w:instrText>
+            </w:r>
+            <w:r>
+              <w:rPr>
+                <w:noProof/>
+                <w:webHidden/>
+              </w:rPr>
+            </w:r>
+            <w:r>
+              <w:rPr>
+                <w:noProof/>
+                <w:webHidden/>
+              </w:rPr>
+              <w:fldChar w:fldCharType="separate"/>
+            </w:r>
+            <w:r>
+              <w:rPr>
+                <w:noProof/>
+                <w:webHidden/>
+              </w:rPr>
+              <w:t>2</w:t>
+            </w:r>
+            <w:r>
+              <w:rPr>
+                <w:noProof/>
+                <w:webHidden/>
+              </w:rPr>
+              <w:fldChar w:fldCharType="end"/>
+            </w:r>
+          </w:hyperlink>
+        </w:p>
+        <w:p>
+          <w:pPr>
+            <w:pStyle w:val="TDC2"/>
+            <w:tabs>
+              <w:tab w:val="right" w:leader="dot" w:pos="8494"/>
+            </w:tabs>
+            <w:rPr>
+              <w:noProof/>
+            </w:rPr>
+          </w:pPr>
+          <w:hyperlink w:anchor="_Toc179213725" w:history="1">
+            <w:r>
+              <w:rPr>
+                <w:rStyle w:val="Hipervnculo"/>
+                <w:noProof/>
+              </w:rPr>
+              <w:t>Clientes por línea de comandos:</w:t>
+            </w:r>
+            <w:r>
+              <w:rPr>
+                <w:noProof/>
+                <w:webHidden/>
+              </w:rPr>
+              <w:tab/>
+            </w:r>
+            <w:r>
+              <w:rPr>
+                <w:noProof/>
+                <w:webHidden/>
+              </w:rPr>
+              <w:fldChar w:fldCharType="begin"/>
+            </w:r>
+            <w:r>
+              <w:rPr>
+                <w:noProof/>
+                <w:webHidden/>
+              </w:rPr>
+              <w:instrText xml:space="preserve"> PAGEREF _Toc179213725 \h </w:instrText>
+            </w:r>
+            <w:r>
+              <w:rPr>
+                <w:noProof/>
+                <w:webHidden/>
+              </w:rPr>
+            </w:r>
+            <w:r>
+              <w:rPr>
+                <w:noProof/>
+                <w:webHidden/>
+              </w:rPr>
+              <w:fldChar w:fldCharType="separate"/>
+            </w:r>
+            <w:r>
+              <w:rPr>
+                <w:noProof/>
+                <w:webHidden/>
+              </w:rPr>
+              <w:t>2</w:t>
+            </w:r>
+            <w:r>
+              <w:rPr>
+                <w:noProof/>
+                <w:webHidden/>
+              </w:rPr>
+              <w:fldChar w:fldCharType="end"/>
+            </w:r>
+          </w:hyperlink>
+        </w:p>
+        <w:p>
+          <w:pPr>
+            <w:pStyle w:val="TDC2"/>
+            <w:tabs>
+              <w:tab w:val="right" w:leader="dot" w:pos="8494"/>
+            </w:tabs>
+            <w:rPr>
+              <w:noProof/>
+            </w:rPr>
+          </w:pPr>
+          <w:hyperlink w:anchor="_Toc179213726" w:history="1">
+            <w:r>
+              <w:rPr>
+                <w:rStyle w:val="Hipervnculo"/>
+                <w:noProof/>
+              </w:rPr>
+              <w:t>Clientes gráficos:</w:t>
+            </w:r>
+            <w:r>
+              <w:rPr>
+                <w:noProof/>
+                <w:webHidden/>
+              </w:rPr>
+              <w:tab/>
+            </w:r>
+            <w:r>
+              <w:rPr>
+                <w:noProof/>
+                <w:webHidden/>
+              </w:rPr>
+              <w:fldChar w:fldCharType="begin"/>
+            </w:r>
+            <w:r>
+              <w:rPr>
+                <w:noProof/>
+                <w:webHidden/>
+              </w:rPr>
+              <w:instrText xml:space="preserve"> PAGEREF _Toc179213726 \h </w:instrText>
+            </w:r>
+            <w:r>
+              <w:rPr>
+                <w:noProof/>
+                <w:webHidden/>
+              </w:rPr>
+            </w:r>
+            <w:r>
+              <w:rPr>
+                <w:noProof/>
+                <w:webHidden/>
+              </w:rPr>
+              <w:fldChar w:fldCharType="separate"/>
+            </w:r>
+            <w:r>
+              <w:rPr>
+                <w:noProof/>
+                <w:webHidden/>
+              </w:rPr>
+              <w:t>3</w:t>
+            </w:r>
+            <w:r>
+              <w:rPr>
+                <w:noProof/>
+                <w:webHidden/>
+              </w:rPr>
+              <w:fldChar w:fldCharType="end"/>
+            </w:r>
+          </w:hyperlink>
+        </w:p>
+        <w:p>
+          <w:pPr>
+            <w:pStyle w:val="TDC2"/>
+            <w:tabs>
+              <w:tab w:val="right" w:leader="dot" w:pos="8494"/>
+            </w:tabs>
+            <w:rPr>
+              <w:noProof/>
+            </w:rPr>
+          </w:pPr>
+          <w:hyperlink w:anchor="_Toc179213727" w:history="1">
+            <w:r>
+              <w:rPr>
+                <w:rStyle w:val="Hipervnculo"/>
+                <w:noProof/>
+              </w:rPr>
+              <w:t>Navegadores y exploradores:</w:t>
+            </w:r>
+            <w:r>
+              <w:rPr>
+                <w:noProof/>
+                <w:webHidden/>
+              </w:rPr>
+              <w:tab/>
+            </w:r>
+            <w:r>
+              <w:rPr>
+                <w:noProof/>
+                <w:webHidden/>
+              </w:rPr>
+              <w:fldChar w:fldCharType="begin"/>
+            </w:r>
+            <w:r>
+              <w:rPr>
+                <w:noProof/>
+                <w:webHidden/>
+              </w:rPr>
+              <w:instrText xml:space="preserve"> PAGEREF _Toc179213727 \h </w:instrText>
+            </w:r>
+            <w:r>
+              <w:rPr>
+                <w:noProof/>
+                <w:webHidden/>
+              </w:rPr>
+            </w:r>
+            <w:r>
+              <w:rPr>
+                <w:noProof/>
+                <w:webHidden/>
+              </w:rPr>
+              <w:fldChar w:fldCharType="separate"/>
+            </w:r>
+            <w:r>
+              <w:rPr>
+                <w:noProof/>
+                <w:webHidden/>
+              </w:rPr>
+              <w:t>3</w:t>
+            </w:r>
+            <w:r>
+              <w:rPr>
+                <w:noProof/>
+                <w:webHidden/>
+              </w:rPr>
+              <w:fldChar w:fldCharType="end"/>
+            </w:r>
+          </w:hyperlink>
+        </w:p>
+        <w:p>
+          <w:pPr>
+            <w:pStyle w:val="TDC2"/>
+            <w:tabs>
+              <w:tab w:val="right" w:leader="dot" w:pos="8494"/>
+            </w:tabs>
+            <w:rPr>
+              <w:noProof/>
+            </w:rPr>
+          </w:pPr>
+          <w:hyperlink w:anchor="_Toc179213728" w:history="1">
+            <w:r>
+              <w:rPr>
+                <w:rStyle w:val="Hipervnculo"/>
+                <w:noProof/>
+              </w:rPr>
+              <w:t>Protocolo FTP:</w:t>
+            </w:r>
+            <w:r>
+              <w:rPr>
+                <w:noProof/>
+                <w:webHidden/>
+              </w:rPr>
+              <w:tab/>
+            </w:r>
+            <w:r>
+              <w:rPr>
+                <w:noProof/>
+                <w:webHidden/>
+              </w:rPr>
+              <w:fldChar w:fldCharType="begin"/>
+            </w:r>
+            <w:r>
+              <w:rPr>
+                <w:noProof/>
+                <w:webHidden/>
+              </w:rPr>
+              <w:instrText xml:space="preserve"> PAGEREF _Toc179213728 \h </w:instrText>
+            </w:r>
+            <w:r>
+              <w:rPr>
+                <w:noProof/>
+                <w:webHidden/>
+              </w:rPr>
+            </w:r>
+            <w:r>
+              <w:rPr>
+                <w:noProof/>
+                <w:webHidden/>
+              </w:rPr>
+              <w:fldChar w:fldCharType="separate"/>
+            </w:r>
+            <w:r>
+              <w:rPr>
+                <w:noProof/>
+                <w:webHidden/>
+              </w:rPr>
+              <w:t>3</w:t>
+            </w:r>
+            <w:r>
+              <w:rPr>
+                <w:noProof/>
+                <w:webHidden/>
+              </w:rPr>
+              <w:fldChar w:fldCharType="end"/>
+            </w:r>
+          </w:hyperlink>
+        </w:p>
+        <w:p>
+          <w:pPr>
+            <w:pStyle w:val="TDC2"/>
+            <w:tabs>
+              <w:tab w:val="right" w:leader="dot" w:pos="8494"/>
+            </w:tabs>
+            <w:rPr>
+              <w:noProof/>
+            </w:rPr>
+          </w:pPr>
+          <w:hyperlink w:anchor="_Toc179213729" w:history="1">
+            <w:r>
+              <w:rPr>
+                <w:rStyle w:val="Hipervnculo"/>
+                <w:noProof/>
+              </w:rPr>
+              <w:t>Tipos de acceso:</w:t>
+            </w:r>
+            <w:r>
+              <w:rPr>
+                <w:noProof/>
+                <w:webHidden/>
+              </w:rPr>
+              <w:tab/>
+            </w:r>
+            <w:r>
+              <w:rPr>
+                <w:noProof/>
+                <w:webHidden/>
+              </w:rPr>
+              <w:fldChar w:fldCharType="begin"/>
+            </w:r>
+            <w:r>
+              <w:rPr>
+                <w:noProof/>
+                <w:webHidden/>
+              </w:rPr>
+              <w:instrText xml:space="preserve"> PAGEREF _Toc179213729 \h </w:instrText>
+            </w:r>
+            <w:r>
+              <w:rPr>
+                <w:noProof/>
+                <w:webHidden/>
+              </w:rPr>
+            </w:r>
+            <w:r>
+              <w:rPr>
+                <w:noProof/>
+                <w:webHidden/>
+              </w:rPr>
+              <w:fldChar w:fldCharType="separate"/>
+            </w:r>
+            <w:r>
+              <w:rPr>
+                <w:noProof/>
+                <w:webHidden/>
+              </w:rPr>
+              <w:t>3</w:t>
+            </w:r>
+            <w:r>
+              <w:rPr>
+                <w:noProof/>
+                <w:webHidden/>
+              </w:rPr>
+              <w:fldChar w:fldCharType="end"/>
+            </w:r>
+          </w:hyperlink>
+        </w:p>
+        <w:p>
+          <w:pPr>
+            <w:pStyle w:val="TDC2"/>
+            <w:tabs>
+              <w:tab w:val="right" w:leader="dot" w:pos="8494"/>
+            </w:tabs>
+            <w:rPr>
+              <w:noProof/>
+            </w:rPr>
+          </w:pPr>
+          <w:hyperlink w:anchor="_Toc179213730" w:history="1">
+            <w:r>
+              <w:rPr>
+                <w:rStyle w:val="Hipervnculo"/>
+                <w:noProof/>
+              </w:rPr>
+              <w:t>Conexiones:</w:t>
+            </w:r>
+            <w:r>
+              <w:rPr>
+                <w:noProof/>
+                <w:webHidden/>
+              </w:rPr>
+              <w:tab/>
+            </w:r>
+            <w:r>
+              <w:rPr>
+                <w:noProof/>
+                <w:webHidden/>
+              </w:rPr>
+              <w:fldChar w:fldCharType="begin"/>
+            </w:r>
+            <w:r>
+              <w:rPr>
+                <w:noProof/>
+                <w:webHidden/>
+              </w:rPr>
+              <w:instrText xml:space="preserve"> PAGEREF _Toc179213730 \h </w:instrText>
+            </w:r>
+            <w:r>
+              <w:rPr>
+                <w:noProof/>
+                <w:webHidden/>
+              </w:rPr>
+            </w:r>
+            <w:r>
+              <w:rPr>
+                <w:noProof/>
+                <w:webHidden/>
+              </w:rPr>
+              <w:fldChar w:fldCharType="separate"/>
+            </w:r>
+            <w:r>
+              <w:rPr>
+                <w:noProof/>
+                <w:webHidden/>
+              </w:rPr>
+              <w:t>4</w:t>
+            </w:r>
+            <w:r>
+              <w:rPr>
+                <w:noProof/>
+                <w:webHidden/>
+              </w:rPr>
+              <w:fldChar w:fldCharType="end"/>
+            </w:r>
+          </w:hyperlink>
+        </w:p>
+        <w:p>
+          <w:pPr>
+            <w:pStyle w:val="TDC2"/>
+            <w:tabs>
+              <w:tab w:val="right" w:leader="dot" w:pos="8494"/>
+            </w:tabs>
+            <w:rPr>
+              <w:noProof/>
+            </w:rPr>
+          </w:pPr>
+          <w:hyperlink w:anchor="_Toc179213731" w:history="1">
+            <w:r>
+              <w:rPr>
+                <w:rStyle w:val="Hipervnculo"/>
+                <w:noProof/>
+              </w:rPr>
+              <w:t>Conexión de control:</w:t>
+            </w:r>
+            <w:r>
+              <w:rPr>
+                <w:noProof/>
+                <w:webHidden/>
+              </w:rPr>
+              <w:tab/>
+            </w:r>
+            <w:r>
+              <w:rPr>
+                <w:noProof/>
+                <w:webHidden/>
+              </w:rPr>
+              <w:fldChar w:fldCharType="begin"/>
+            </w:r>
+            <w:r>
+              <w:rPr>
+                <w:noProof/>
+                <w:webHidden/>
+              </w:rPr>
+              <w:instrText xml:space="preserve"> PAGEREF _Toc179213731 \h </w:instrText>
+            </w:r>
+            <w:r>
+              <w:rPr>
+                <w:noProof/>
+                <w:webHidden/>
+              </w:rPr>
+            </w:r>
+            <w:r>
+              <w:rPr>
+                <w:noProof/>
+                <w:webHidden/>
+              </w:rPr>
+              <w:fldChar w:fldCharType="separate"/>
+            </w:r>
+            <w:r>
+              <w:rPr>
+                <w:noProof/>
+                <w:webHidden/>
+              </w:rPr>
+              <w:t>4</w:t>
+            </w:r>
+            <w:r>
+              <w:rPr>
+                <w:noProof/>
+                <w:webHidden/>
+              </w:rPr>
+              <w:fldChar w:fldCharType="end"/>
+            </w:r>
+          </w:hyperlink>
+        </w:p>
+        <w:p>
+          <w:pPr>
+            <w:pStyle w:val="TDC2"/>
+            <w:tabs>
+              <w:tab w:val="right" w:leader="dot" w:pos="8494"/>
+            </w:tabs>
+            <w:rPr>
+              <w:noProof/>
+            </w:rPr>
+          </w:pPr>
+          <w:hyperlink w:anchor="_Toc179213732" w:history="1">
+            <w:r>
+              <w:rPr>
+                <w:rStyle w:val="Hipervnculo"/>
+                <w:noProof/>
+              </w:rPr>
+              <w:t>Conexión de datos:</w:t>
+            </w:r>
+            <w:r>
+              <w:rPr>
+                <w:noProof/>
+                <w:webHidden/>
+              </w:rPr>
+              <w:tab/>
+            </w:r>
+            <w:r>
+              <w:rPr>
+                <w:noProof/>
+                <w:webHidden/>
+              </w:rPr>
+              <w:fldChar w:fldCharType="begin"/>
+            </w:r>
+            <w:r>
+              <w:rPr>
+                <w:noProof/>
+                <w:webHidden/>
+              </w:rPr>
+              <w:instrText xml:space="preserve"> PAGEREF _Toc179213732 \h </w:instrText>
+            </w:r>
+            <w:r>
+              <w:rPr>
+                <w:noProof/>
+                <w:webHidden/>
+              </w:rPr>
+            </w:r>
+            <w:r>
+              <w:rPr>
+                <w:noProof/>
+                <w:webHidden/>
+              </w:rPr>
+              <w:fldChar w:fldCharType="separate"/>
+            </w:r>
+            <w:r>
+              <w:rPr>
+                <w:noProof/>
+                <w:webHidden/>
+              </w:rPr>
+              <w:t>4</w:t>
+            </w:r>
+            <w:r>
+              <w:rPr>
+                <w:noProof/>
+                <w:webHidden/>
+              </w:rPr>
+              <w:fldChar w:fldCharType="end"/>
+            </w:r>
+          </w:hyperlink>
+        </w:p>
+        <w:p>
+          <w:pPr>
+            <w:pStyle w:val="TDC2"/>
+            <w:tabs>
+              <w:tab w:val="right" w:leader="dot" w:pos="8494"/>
+            </w:tabs>
+            <w:rPr>
+              <w:noProof/>
+            </w:rPr>
+          </w:pPr>
+          <w:hyperlink w:anchor="_Toc179213733" w:history="1">
+            <w:r>
+              <w:rPr>
+                <w:rStyle w:val="Hipervnculo"/>
+                <w:noProof/>
+              </w:rPr>
+              <w:t>Conexiones:</w:t>
+            </w:r>
+            <w:r>
+              <w:rPr>
+                <w:noProof/>
+                <w:webHidden/>
+              </w:rPr>
+              <w:tab/>
+            </w:r>
+            <w:r>
+              <w:rPr>
+                <w:noProof/>
+                <w:webHidden/>
+              </w:rPr>
+              <w:fldChar w:fldCharType="begin"/>
+            </w:r>
+            <w:r>
+              <w:rPr>
+                <w:noProof/>
+                <w:webHidden/>
+              </w:rPr>
+              <w:instrText xml:space="preserve"> PAGEREF _Toc179213733 \h </w:instrText>
+            </w:r>
+            <w:r>
+              <w:rPr>
+                <w:noProof/>
+                <w:webHidden/>
+              </w:rPr>
+            </w:r>
+            <w:r>
+              <w:rPr>
+                <w:noProof/>
+                <w:webHidden/>
+              </w:rPr>
+              <w:fldChar w:fldCharType="separate"/>
+            </w:r>
+            <w:r>
+              <w:rPr>
+                <w:noProof/>
+                <w:webHidden/>
+              </w:rPr>
+              <w:t>4</w:t>
+            </w:r>
+            <w:r>
+              <w:rPr>
+                <w:noProof/>
+                <w:webHidden/>
+              </w:rPr>
+              <w:fldChar w:fldCharType="end"/>
+            </w:r>
+          </w:hyperlink>
+        </w:p>
+        <w:p>
+          <w:pPr>
+            <w:pStyle w:val="TDC2"/>
+            <w:tabs>
+              <w:tab w:val="right" w:leader="dot" w:pos="8494"/>
+            </w:tabs>
+            <w:rPr>
+              <w:noProof/>
+            </w:rPr>
+          </w:pPr>
+          <w:hyperlink w:anchor="_Toc179213734" w:history="1">
+            <w:r>
+              <w:rPr>
+                <w:rStyle w:val="Hipervnculo"/>
+                <w:noProof/>
+              </w:rPr>
+              <w:t>Modos de conexión</w:t>
+            </w:r>
+            <w:r>
+              <w:rPr>
+                <w:noProof/>
+                <w:webHidden/>
+              </w:rPr>
+              <w:tab/>
+            </w:r>
+            <w:r>
+              <w:rPr>
+                <w:noProof/>
+                <w:webHidden/>
+              </w:rPr>
+              <w:fldChar w:fldCharType="begin"/>
+            </w:r>
+            <w:r>
+              <w:rPr>
+                <w:noProof/>
+                <w:webHidden/>
+              </w:rPr>
+              <w:instrText xml:space="preserve"> PAGEREF _Toc179213734 \h </w:instrText>
+            </w:r>
+            <w:r>
+              <w:rPr>
+                <w:noProof/>
+                <w:webHidden/>
+              </w:rPr>
+            </w:r>
+            <w:r>
+              <w:rPr>
+                <w:noProof/>
+                <w:webHidden/>
+              </w:rPr>
+              <w:fldChar w:fldCharType="separate"/>
+            </w:r>
+            <w:r>
+              <w:rPr>
+                <w:noProof/>
+                <w:webHidden/>
+              </w:rPr>
+              <w:t>4</w:t>
+            </w:r>
+            <w:r>
+              <w:rPr>
+                <w:noProof/>
+                <w:webHidden/>
+              </w:rPr>
+              <w:fldChar w:fldCharType="end"/>
+            </w:r>
+          </w:hyperlink>
+        </w:p>
+        <w:p>
+          <w:pPr>
+            <w:pStyle w:val="TDC3"/>
+            <w:tabs>
+              <w:tab w:val="left" w:pos="880"/>
+              <w:tab w:val="right" w:leader="dot" w:pos="8494"/>
+            </w:tabs>
+            <w:rPr>
+              <w:noProof/>
+            </w:rPr>
+          </w:pPr>
+          <w:hyperlink w:anchor="_Toc179213735" w:history="1">
+            <w:r>
+              <w:rPr>
+                <w:rStyle w:val="Hipervnculo"/>
+                <w:rFonts w:ascii="Noto Sans Symbols" w:eastAsia="Noto Sans Symbols" w:hAnsi="Noto Sans Symbols" w:cs="Noto Sans Symbols"/>
+                <w:noProof/>
+              </w:rPr>
+              <w:t>●</w:t>
+            </w:r>
+            <w:r>
+              <w:rPr>
+                <w:noProof/>
+              </w:rPr>
+              <w:tab/>
+            </w:r>
+            <w:r>
+              <w:rPr>
+                <w:rStyle w:val="Hipervnculo"/>
+                <w:noProof/>
+              </w:rPr>
+              <w:t>Modo activo</w:t>
+            </w:r>
+            <w:r>
+              <w:rPr>
+                <w:noProof/>
+                <w:webHidden/>
+              </w:rPr>
+              <w:tab/>
+            </w:r>
+            <w:r>
+              <w:rPr>
+                <w:noProof/>
+                <w:webHidden/>
+              </w:rPr>
+              <w:fldChar w:fldCharType="begin"/>
+            </w:r>
+            <w:r>
+              <w:rPr>
+                <w:noProof/>
+                <w:webHidden/>
+              </w:rPr>
+              <w:instrText xml:space="preserve"> PAGEREF _Toc179213735 \h </w:instrText>
+            </w:r>
+            <w:r>
+              <w:rPr>
+                <w:noProof/>
+                <w:webHidden/>
+              </w:rPr>
+            </w:r>
+            <w:r>
+              <w:rPr>
+                <w:noProof/>
+                <w:webHidden/>
+              </w:rPr>
+              <w:fldChar w:fldCharType="separate"/>
+            </w:r>
+            <w:r>
+              <w:rPr>
+                <w:noProof/>
+                <w:webHidden/>
+              </w:rPr>
+              <w:t>4</w:t>
+            </w:r>
+            <w:r>
+              <w:rPr>
+                <w:noProof/>
+                <w:webHidden/>
+              </w:rPr>
+              <w:fldChar w:fldCharType="end"/>
+            </w:r>
+          </w:hyperlink>
+        </w:p>
+        <w:p>
+          <w:pPr>
+            <w:pStyle w:val="TDC3"/>
+            <w:tabs>
+              <w:tab w:val="left" w:pos="880"/>
+              <w:tab w:val="right" w:leader="dot" w:pos="8494"/>
+            </w:tabs>
+            <w:rPr>
+              <w:noProof/>
+            </w:rPr>
+          </w:pPr>
+          <w:hyperlink w:anchor="_Toc179213736" w:history="1">
+            <w:r>
+              <w:rPr>
+                <w:rStyle w:val="Hipervnculo"/>
+                <w:rFonts w:ascii="Noto Sans Symbols" w:eastAsia="Noto Sans Symbols" w:hAnsi="Noto Sans Symbols" w:cs="Noto Sans Symbols"/>
+                <w:noProof/>
+              </w:rPr>
+              <w:t>●</w:t>
+            </w:r>
+            <w:r>
+              <w:rPr>
+                <w:noProof/>
+              </w:rPr>
+              <w:tab/>
+            </w:r>
+            <w:r>
+              <w:rPr>
+                <w:rStyle w:val="Hipervnculo"/>
+                <w:noProof/>
+              </w:rPr>
+              <w:t>Modo pasivo:</w:t>
+            </w:r>
+            <w:r>
+              <w:rPr>
+                <w:noProof/>
+                <w:webHidden/>
+              </w:rPr>
+              <w:tab/>
+            </w:r>
+            <w:r>
+              <w:rPr>
+                <w:noProof/>
+                <w:webHidden/>
+              </w:rPr>
+              <w:fldChar w:fldCharType="begin"/>
+            </w:r>
+            <w:r>
+              <w:rPr>
+                <w:noProof/>
+                <w:webHidden/>
+              </w:rPr>
+              <w:instrText xml:space="preserve"> PAGEREF _Toc179213736 \h </w:instrText>
+            </w:r>
+            <w:r>
+              <w:rPr>
+                <w:noProof/>
+                <w:webHidden/>
+              </w:rPr>
+            </w:r>
+            <w:r>
+              <w:rPr>
+                <w:noProof/>
+                <w:webHidden/>
+              </w:rPr>
+              <w:fldChar w:fldCharType="separate"/>
+            </w:r>
+            <w:r>
+              <w:rPr>
+                <w:noProof/>
+                <w:webHidden/>
+              </w:rPr>
+              <w:t>5</w:t>
+            </w:r>
+            <w:r>
+              <w:rPr>
+                <w:noProof/>
+                <w:webHidden/>
+              </w:rPr>
+              <w:fldChar w:fldCharType="end"/>
+            </w:r>
+          </w:hyperlink>
+        </w:p>
+        <w:p>
+          <w:pPr>
+            <w:pStyle w:val="TDC1"/>
+            <w:tabs>
+              <w:tab w:val="right" w:leader="dot" w:pos="8494"/>
+            </w:tabs>
+            <w:rPr>
+              <w:noProof/>
+            </w:rPr>
+          </w:pPr>
+          <w:hyperlink w:anchor="_Toc179213737" w:history="1">
+            <w:r>
+              <w:rPr>
+                <w:rStyle w:val="Hipervnculo"/>
+                <w:noProof/>
+              </w:rPr>
+              <w:t>Tipos de transferencia de archivos</w:t>
+            </w:r>
+            <w:r>
+              <w:rPr>
+                <w:noProof/>
+                <w:webHidden/>
+              </w:rPr>
+              <w:tab/>
+            </w:r>
+            <w:r>
+              <w:rPr>
+                <w:noProof/>
+                <w:webHidden/>
+              </w:rPr>
+              <w:fldChar w:fldCharType="begin"/>
+            </w:r>
+            <w:r>
+              <w:rPr>
+                <w:noProof/>
+                <w:webHidden/>
+              </w:rPr>
+              <w:instrText xml:space="preserve"> PAGEREF _Toc179213737 \h </w:instrText>
+            </w:r>
+            <w:r>
+              <w:rPr>
+                <w:noProof/>
+                <w:webHidden/>
+              </w:rPr>
+            </w:r>
+            <w:r>
+              <w:rPr>
+                <w:noProof/>
+                <w:webHidden/>
+              </w:rPr>
+              <w:fldChar w:fldCharType="separate"/>
+            </w:r>
+            <w:r>
+              <w:rPr>
+                <w:noProof/>
+                <w:webHidden/>
+              </w:rPr>
+              <w:t>5</w:t>
+            </w:r>
+            <w:r>
+              <w:rPr>
+                <w:noProof/>
+                <w:webHidden/>
+              </w:rPr>
+              <w:fldChar w:fldCharType="end"/>
+            </w:r>
+          </w:hyperlink>
+        </w:p>
+        <w:p>
+          <w:pPr>
+            <w:pStyle w:val="TDC1"/>
+            <w:tabs>
+              <w:tab w:val="right" w:leader="dot" w:pos="8494"/>
+            </w:tabs>
+            <w:rPr>
+              <w:noProof/>
+            </w:rPr>
+          </w:pPr>
+          <w:hyperlink w:anchor="_Toc179213738" w:history="1">
+            <w:r>
+              <w:rPr>
+                <w:rStyle w:val="Hipervnculo"/>
+                <w:noProof/>
+              </w:rPr>
+              <w:t>(in)Seguridad</w:t>
+            </w:r>
+            <w:r>
+              <w:rPr>
+                <w:noProof/>
+                <w:webHidden/>
+              </w:rPr>
+              <w:tab/>
+            </w:r>
+            <w:r>
+              <w:rPr>
+                <w:noProof/>
+                <w:webHidden/>
+              </w:rPr>
+              <w:fldChar w:fldCharType="begin"/>
+            </w:r>
+            <w:r>
+              <w:rPr>
+                <w:noProof/>
+                <w:webHidden/>
+              </w:rPr>
+              <w:instrText xml:space="preserve"> PAGEREF _Toc179213738 \h </w:instrText>
+            </w:r>
+            <w:r>
+              <w:rPr>
+                <w:noProof/>
+                <w:webHidden/>
+              </w:rPr>
+            </w:r>
+            <w:r>
+              <w:rPr>
+                <w:noProof/>
+                <w:webHidden/>
+              </w:rPr>
+              <w:fldChar w:fldCharType="separate"/>
+            </w:r>
+            <w:r>
+              <w:rPr>
+                <w:noProof/>
+                <w:webHidden/>
+              </w:rPr>
+              <w:t>5</w:t>
+            </w:r>
+            <w:r>
+              <w:rPr>
+                <w:noProof/>
+                <w:webHidden/>
+              </w:rPr>
+              <w:fldChar w:fldCharType="end"/>
+            </w:r>
+          </w:hyperlink>
+        </w:p>
+        <w:p>
+          <w:pPr>
+            <w:pStyle w:val="TDC1"/>
+            <w:tabs>
+              <w:tab w:val="right" w:leader="dot" w:pos="8494"/>
+            </w:tabs>
+            <w:rPr>
+              <w:noProof/>
+            </w:rPr>
+          </w:pPr>
+          <w:hyperlink w:anchor="_Toc179213739" w:history="1">
+            <w:r>
+              <w:rPr>
+                <w:rStyle w:val="Hipervnculo"/>
+                <w:noProof/>
+              </w:rPr>
+              <w:t>FTPS (FTP/SSL)</w:t>
+            </w:r>
+            <w:r>
+              <w:rPr>
+                <w:noProof/>
+                <w:webHidden/>
+              </w:rPr>
+              <w:tab/>
+            </w:r>
+            <w:r>
+              <w:rPr>
+                <w:noProof/>
+                <w:webHidden/>
+              </w:rPr>
+              <w:fldChar w:fldCharType="begin"/>
+            </w:r>
+            <w:r>
+              <w:rPr>
+                <w:noProof/>
+                <w:webHidden/>
+              </w:rPr>
+              <w:instrText xml:space="preserve"> PAGEREF _Toc179213739 \h </w:instrText>
+            </w:r>
+            <w:r>
+              <w:rPr>
+                <w:noProof/>
+                <w:webHidden/>
+              </w:rPr>
+            </w:r>
+            <w:r>
+              <w:rPr>
+                <w:noProof/>
+                <w:webHidden/>
+              </w:rPr>
+              <w:fldChar w:fldCharType="separate"/>
+            </w:r>
+            <w:r>
+              <w:rPr>
+                <w:noProof/>
+                <w:webHidden/>
+              </w:rPr>
+              <w:t>6</w:t>
+            </w:r>
+            <w:r>
+              <w:rPr>
+                <w:noProof/>
+                <w:webHidden/>
+              </w:rPr>
+              <w:fldChar w:fldCharType="end"/>
+            </w:r>
+          </w:hyperlink>
+        </w:p>
+        <w:p>
+          <w:pPr>
+            <w:pStyle w:val="TDC2"/>
+            <w:tabs>
+              <w:tab w:val="right" w:leader="dot" w:pos="8494"/>
+            </w:tabs>
+            <w:rPr>
+              <w:noProof/>
+            </w:rPr>
+          </w:pPr>
+          <w:hyperlink w:anchor="_Toc179213740" w:history="1">
+            <w:r>
+              <w:rPr>
+                <w:rStyle w:val="Hipervnculo"/>
+                <w:noProof/>
+              </w:rPr>
+              <w:t>FTPS Implícito</w:t>
+            </w:r>
+            <w:r>
+              <w:rPr>
+                <w:noProof/>
+                <w:webHidden/>
+              </w:rPr>
+              <w:tab/>
+            </w:r>
+            <w:r>
+              <w:rPr>
+                <w:noProof/>
+                <w:webHidden/>
+              </w:rPr>
+              <w:fldChar w:fldCharType="begin"/>
+            </w:r>
+            <w:r>
+              <w:rPr>
+                <w:noProof/>
+                <w:webHidden/>
+              </w:rPr>
+              <w:instrText xml:space="preserve"> PAGEREF _Toc179213740 \h </w:instrText>
+            </w:r>
+            <w:r>
+              <w:rPr>
+                <w:noProof/>
+                <w:webHidden/>
+              </w:rPr>
+            </w:r>
+            <w:r>
+              <w:rPr>
+                <w:noProof/>
+                <w:webHidden/>
+              </w:rPr>
+              <w:fldChar w:fldCharType="separate"/>
+            </w:r>
+            <w:r>
+              <w:rPr>
+                <w:noProof/>
+                <w:webHidden/>
+              </w:rPr>
+              <w:t>6</w:t>
+            </w:r>
+            <w:r>
+              <w:rPr>
+                <w:noProof/>
+                <w:webHidden/>
+              </w:rPr>
+              <w:fldChar w:fldCharType="end"/>
+            </w:r>
+          </w:hyperlink>
+        </w:p>
+        <w:p>
+          <w:pPr>
+            <w:pStyle w:val="TDC2"/>
+            <w:tabs>
+              <w:tab w:val="right" w:leader="dot" w:pos="8494"/>
+            </w:tabs>
+            <w:rPr>
+              <w:noProof/>
+            </w:rPr>
+          </w:pPr>
+          <w:hyperlink w:anchor="_Toc179213741" w:history="1">
+            <w:r>
+              <w:rPr>
+                <w:rStyle w:val="Hipervnculo"/>
+                <w:noProof/>
+              </w:rPr>
+              <w:t>FTPS Explícito (FTPES)</w:t>
+            </w:r>
+            <w:r>
+              <w:rPr>
+                <w:noProof/>
+                <w:webHidden/>
+              </w:rPr>
+              <w:tab/>
+            </w:r>
+            <w:r>
+              <w:rPr>
+                <w:noProof/>
+                <w:webHidden/>
+              </w:rPr>
+              <w:fldChar w:fldCharType="begin"/>
+            </w:r>
+            <w:r>
+              <w:rPr>
+                <w:noProof/>
+                <w:webHidden/>
+              </w:rPr>
+              <w:instrText xml:space="preserve"> PAGEREF _Toc179213741 \h </w:instrText>
+            </w:r>
+            <w:r>
+              <w:rPr>
+                <w:noProof/>
+                <w:webHidden/>
+              </w:rPr>
+            </w:r>
+            <w:r>
+              <w:rPr>
+                <w:noProof/>
+                <w:webHidden/>
+              </w:rPr>
+              <w:fldChar w:fldCharType="separate"/>
+            </w:r>
+            <w:r>
+              <w:rPr>
+                <w:noProof/>
+                <w:webHidden/>
+              </w:rPr>
+              <w:t>6</w:t>
+            </w:r>
+            <w:r>
+              <w:rPr>
+                <w:noProof/>
+                <w:webHidden/>
+              </w:rPr>
+              <w:fldChar w:fldCharType="end"/>
+            </w:r>
+          </w:hyperlink>
+        </w:p>
+        <w:p>
+          <w:pPr>
+            <w:pStyle w:val="TDC1"/>
+            <w:tabs>
+              <w:tab w:val="right" w:leader="dot" w:pos="8494"/>
+            </w:tabs>
+            <w:rPr>
+              <w:noProof/>
+            </w:rPr>
+          </w:pPr>
+          <w:hyperlink w:anchor="_Toc179213742" w:history="1">
+            <w:r>
+              <w:rPr>
+                <w:rStyle w:val="Hipervnculo"/>
+                <w:noProof/>
+              </w:rPr>
+              <w:t>Fundamentación teórica</w:t>
+            </w:r>
+            <w:r>
+              <w:rPr>
+                <w:noProof/>
+                <w:webHidden/>
+              </w:rPr>
+              <w:tab/>
+            </w:r>
+            <w:r>
+              <w:rPr>
+                <w:noProof/>
+                <w:webHidden/>
+              </w:rPr>
+              <w:fldChar w:fldCharType="begin"/>
+            </w:r>
+            <w:r>
+              <w:rPr>
+                <w:noProof/>
+                <w:webHidden/>
+              </w:rPr>
+              <w:instrText xml:space="preserve"> PAGEREF _Toc179213742 \h </w:instrText>
+            </w:r>
+            <w:r>
+              <w:rPr>
+                <w:noProof/>
+                <w:webHidden/>
+              </w:rPr>
+            </w:r>
+            <w:r>
+              <w:rPr>
+                <w:noProof/>
+                <w:webHidden/>
+              </w:rPr>
+              <w:fldChar w:fldCharType="separate"/>
+            </w:r>
+            <w:r>
+              <w:rPr>
+                <w:noProof/>
+                <w:webHidden/>
+              </w:rPr>
+              <w:t>6</w:t>
+            </w:r>
+            <w:r>
+              <w:rPr>
+                <w:noProof/>
+                <w:webHidden/>
+              </w:rPr>
+              <w:fldChar w:fldCharType="end"/>
+            </w:r>
+          </w:hyperlink>
+        </w:p>
+        <w:p>
+          <w:pPr>
+            <w:pStyle w:val="TDC2"/>
+            <w:tabs>
+              <w:tab w:val="right" w:leader="dot" w:pos="8494"/>
+            </w:tabs>
+            <w:rPr>
+              <w:noProof/>
+            </w:rPr>
+          </w:pPr>
+          <w:hyperlink w:anchor="_Toc179213743" w:history="1">
+            <w:r>
+              <w:rPr>
+                <w:rStyle w:val="Hipervnculo"/>
+                <w:noProof/>
+              </w:rPr>
+              <w:t>Investiga, explica cómo funcionan y las diferencias que tienen los servicios p2p, SMB y FTP</w:t>
+            </w:r>
+            <w:r>
+              <w:rPr>
+                <w:noProof/>
+                <w:webHidden/>
+              </w:rPr>
+              <w:tab/>
+            </w:r>
+            <w:r>
+              <w:rPr>
+                <w:noProof/>
+                <w:webHidden/>
+              </w:rPr>
+              <w:fldChar w:fldCharType="begin"/>
+            </w:r>
+            <w:r>
+              <w:rPr>
+                <w:noProof/>
+                <w:webHidden/>
+              </w:rPr>
+              <w:instrText xml:space="preserve"> PAGEREF _Toc179213743 \h </w:instrText>
+            </w:r>
+            <w:r>
+              <w:rPr>
+                <w:noProof/>
+                <w:webHidden/>
+              </w:rPr>
+            </w:r>
+            <w:r>
+              <w:rPr>
+                <w:noProof/>
+                <w:webHidden/>
+              </w:rPr>
+              <w:fldChar w:fldCharType="separate"/>
+            </w:r>
+            <w:r>
+              <w:rPr>
+                <w:noProof/>
+                <w:webHidden/>
+              </w:rPr>
+              <w:t>6</w:t>
+            </w:r>
+            <w:r>
+              <w:rPr>
+                <w:noProof/>
+                <w:webHidden/>
+              </w:rPr>
+              <w:fldChar w:fldCharType="end"/>
+            </w:r>
+          </w:hyperlink>
+        </w:p>
+        <w:p>
+          <w:pPr>
+            <w:pStyle w:val="TDC2"/>
+            <w:tabs>
+              <w:tab w:val="right" w:leader="dot" w:pos="8494"/>
+            </w:tabs>
+            <w:rPr>
+              <w:noProof/>
+            </w:rPr>
+          </w:pPr>
+          <w:hyperlink w:anchor="_Toc179213744" w:history="1">
+            <w:r>
+              <w:rPr>
+                <w:rStyle w:val="Hipervnculo"/>
+                <w:noProof/>
+              </w:rPr>
+              <w:t>Investiga y realiza una comparativa entre distintos servidores(software) FTP</w:t>
+            </w:r>
+            <w:r>
+              <w:rPr>
+                <w:noProof/>
+                <w:webHidden/>
+              </w:rPr>
+              <w:tab/>
+            </w:r>
+            <w:r>
+              <w:rPr>
+                <w:noProof/>
+                <w:webHidden/>
+              </w:rPr>
+              <w:fldChar w:fldCharType="begin"/>
+            </w:r>
+            <w:r>
+              <w:rPr>
+                <w:noProof/>
+                <w:webHidden/>
+              </w:rPr>
+              <w:instrText xml:space="preserve"> PAGEREF _Toc179213744 \h </w:instrText>
+            </w:r>
+            <w:r>
+              <w:rPr>
+                <w:noProof/>
+                <w:webHidden/>
+              </w:rPr>
+            </w:r>
+            <w:r>
+              <w:rPr>
+                <w:noProof/>
+                <w:webHidden/>
+              </w:rPr>
+              <w:fldChar w:fldCharType="separate"/>
+            </w:r>
+            <w:r>
+              <w:rPr>
+                <w:noProof/>
+                <w:webHidden/>
+              </w:rPr>
+              <w:t>7</w:t>
+            </w:r>
+            <w:r>
+              <w:rPr>
+                <w:noProof/>
+                <w:webHidden/>
+              </w:rPr>
+              <w:fldChar w:fldCharType="end"/>
+            </w:r>
+          </w:hyperlink>
+        </w:p>
+        <w:p>
+          <w:pPr>
+            <w:pStyle w:val="TDC2"/>
+            <w:tabs>
+              <w:tab w:val="right" w:leader="dot" w:pos="8494"/>
+            </w:tabs>
+            <w:rPr>
+              <w:noProof/>
+            </w:rPr>
+          </w:pPr>
+          <w:hyperlink w:anchor="_Toc179213745" w:history="1">
+            <w:r>
+              <w:rPr>
+                <w:rStyle w:val="Hipervnculo"/>
+                <w:noProof/>
+              </w:rPr>
+              <w:t>¿Qué son los RFCs?</w:t>
+            </w:r>
+            <w:r>
+              <w:rPr>
+                <w:noProof/>
+                <w:webHidden/>
+              </w:rPr>
+              <w:tab/>
+            </w:r>
+            <w:r>
+              <w:rPr>
+                <w:noProof/>
+                <w:webHidden/>
+              </w:rPr>
+              <w:fldChar w:fldCharType="begin"/>
+            </w:r>
+            <w:r>
+              <w:rPr>
+                <w:noProof/>
+                <w:webHidden/>
+              </w:rPr>
+              <w:instrText xml:space="preserve"> PAGEREF _Toc179213745 \h </w:instrText>
+            </w:r>
+            <w:r>
+              <w:rPr>
+                <w:noProof/>
+                <w:webHidden/>
+              </w:rPr>
+            </w:r>
+            <w:r>
+              <w:rPr>
+                <w:noProof/>
+                <w:webHidden/>
+              </w:rPr>
+              <w:fldChar w:fldCharType="separate"/>
+            </w:r>
+            <w:r>
+              <w:rPr>
+                <w:noProof/>
+                <w:webHidden/>
+              </w:rPr>
+              <w:t>7</w:t>
+            </w:r>
+            <w:r>
+              <w:rPr>
+                <w:noProof/>
+                <w:webHidden/>
+              </w:rPr>
+              <w:fldChar w:fldCharType="end"/>
+            </w:r>
+          </w:hyperlink>
+        </w:p>
+        <w:p>
+          <w:pPr>
+            <w:pStyle w:val="TDC2"/>
+            <w:tabs>
+              <w:tab w:val="right" w:leader="dot" w:pos="8494"/>
+            </w:tabs>
+            <w:rPr>
+              <w:noProof/>
+            </w:rPr>
+          </w:pPr>
+          <w:hyperlink w:anchor="_Toc179213746" w:history="1">
+            <w:r>
+              <w:rPr>
+                <w:rStyle w:val="Hipervnculo"/>
+                <w:noProof/>
+              </w:rPr>
+              <w:t>¿Qué son los RFCs?</w:t>
+            </w:r>
+            <w:r>
+              <w:rPr>
+                <w:noProof/>
+                <w:webHidden/>
+              </w:rPr>
+              <w:tab/>
+            </w:r>
+            <w:r>
+              <w:rPr>
+                <w:noProof/>
+                <w:webHidden/>
+              </w:rPr>
+              <w:fldChar w:fldCharType="begin"/>
+            </w:r>
+            <w:r>
+              <w:rPr>
+                <w:noProof/>
+                <w:webHidden/>
+              </w:rPr>
+              <w:instrText xml:space="preserve"> PAGEREF _Toc179213746 \h </w:instrText>
+            </w:r>
+            <w:r>
+              <w:rPr>
+                <w:noProof/>
+                <w:webHidden/>
+              </w:rPr>
+            </w:r>
+            <w:r>
+              <w:rPr>
+                <w:noProof/>
+                <w:webHidden/>
+              </w:rPr>
+              <w:fldChar w:fldCharType="separate"/>
+            </w:r>
+            <w:r>
+              <w:rPr>
+                <w:noProof/>
+                <w:webHidden/>
+              </w:rPr>
+              <w:t>7</w:t>
+            </w:r>
+            <w:r>
+              <w:rPr>
+                <w:noProof/>
+                <w:webHidden/>
+              </w:rPr>
+              <w:fldChar w:fldCharType="end"/>
+            </w:r>
+          </w:hyperlink>
+        </w:p>
+        <w:p>
+          <w:pPr>
+            <w:pStyle w:val="TDC2"/>
+            <w:tabs>
+              <w:tab w:val="right" w:leader="dot" w:pos="8494"/>
+            </w:tabs>
+            <w:rPr>
+              <w:noProof/>
+            </w:rPr>
+          </w:pPr>
+          <w:hyperlink w:anchor="_Toc179213747" w:history="1">
+            <w:r>
+              <w:rPr>
+                <w:rStyle w:val="Hipervnculo"/>
+                <w:noProof/>
+              </w:rPr>
+              <w:t>¿Qué ventajas ofrece el modo activo en FTP?</w:t>
+            </w:r>
+            <w:r>
+              <w:rPr>
+                <w:noProof/>
+                <w:webHidden/>
+              </w:rPr>
+              <w:tab/>
+            </w:r>
+            <w:r>
+              <w:rPr>
+                <w:noProof/>
+                <w:webHidden/>
+              </w:rPr>
+              <w:fldChar w:fldCharType="begin"/>
+            </w:r>
+            <w:r>
+              <w:rPr>
+                <w:noProof/>
+                <w:webHidden/>
+              </w:rPr>
+              <w:instrText xml:space="preserve"> PAGEREF _Toc179213747 \h </w:instrText>
+            </w:r>
+            <w:r>
+              <w:rPr>
+                <w:noProof/>
+                <w:webHidden/>
+              </w:rPr>
+            </w:r>
+            <w:r>
+              <w:rPr>
+                <w:noProof/>
+                <w:webHidden/>
+              </w:rPr>
+              <w:fldChar w:fldCharType="separate"/>
+            </w:r>
+            <w:r>
+              <w:rPr>
+                <w:noProof/>
+                <w:webHidden/>
+              </w:rPr>
+              <w:t>7</w:t>
+            </w:r>
+            <w:r>
+              <w:rPr>
+                <w:noProof/>
+                <w:webHidden/>
+              </w:rPr>
+              <w:fldChar w:fldCharType="end"/>
+            </w:r>
+          </w:hyperlink>
+        </w:p>
+        <w:p>
+          <w:pPr>
+            <w:pStyle w:val="TDC1"/>
+            <w:tabs>
+              <w:tab w:val="right" w:leader="dot" w:pos="8494"/>
+            </w:tabs>
+            <w:rPr>
+              <w:noProof/>
+            </w:rPr>
+          </w:pPr>
+          <w:hyperlink w:anchor="_Toc179213748" w:history="1">
+            <w:r>
+              <w:rPr>
+                <w:rStyle w:val="Hipervnculo"/>
+                <w:noProof/>
+              </w:rPr>
+              <w:t>Reflexión personal</w:t>
+            </w:r>
+            <w:r>
+              <w:rPr>
+                <w:noProof/>
+                <w:webHidden/>
+              </w:rPr>
+              <w:tab/>
+            </w:r>
+            <w:r>
+              <w:rPr>
+                <w:noProof/>
+                <w:webHidden/>
+              </w:rPr>
+              <w:fldChar w:fldCharType="begin"/>
+            </w:r>
+            <w:r>
+              <w:rPr>
+                <w:noProof/>
+                <w:webHidden/>
+              </w:rPr>
+              <w:instrText xml:space="preserve"> PAGEREF _Toc179213748 \h </w:instrText>
+            </w:r>
+            <w:r>
+              <w:rPr>
+                <w:noProof/>
+                <w:webHidden/>
+              </w:rPr>
+            </w:r>
+            <w:r>
+              <w:rPr>
+                <w:noProof/>
+                <w:webHidden/>
+              </w:rPr>
+              <w:fldChar w:fldCharType="separate"/>
+            </w:r>
+            <w:r>
+              <w:rPr>
+                <w:noProof/>
+                <w:webHidden/>
+              </w:rPr>
+              <w:t>8</w:t>
+            </w:r>
+            <w:r>
+              <w:rPr>
+                <w:noProof/>
+                <w:webHidden/>
+              </w:rPr>
+              <w:fldChar w:fldCharType="end"/>
+            </w:r>
+          </w:hyperlink>
+        </w:p>
+        <w:p>
+          <w:r>
+            <w:rPr>
+              <w:b/>
+              <w:bCs/>
+            </w:rPr>
+            <w:fldChar w:fldCharType="end"/>
+          </w:r>
+        </w:p>
+      </w:sdtContent>
+    </w:sdt>
+    <w:p/>
     <w:p>
       <w:pPr>
         <w:rPr>
@@ -568,18 +2756,16 @@
           <w:szCs w:val="32"/>
         </w:rPr>
       </w:pPr>
-      <w:r>
-        <w:br w:type="page"/>
-      </w:r>
     </w:p>
     <w:p>
       <w:pPr>
         <w:pStyle w:val="Ttulo1"/>
       </w:pPr>
-      <w:r>
-        <w:lastRenderedPageBreak/>
+      <w:bookmarkStart w:id="1" w:name="_Toc179213719"/>
+      <w:r>
         <w:t>Resumen:</w:t>
       </w:r>
+      <w:bookmarkEnd w:id="1"/>
     </w:p>
     <w:p>
       <w:pPr>
@@ -587,8 +2773,12 @@
       </w:pPr>
       <w:r>
         <w:tab/>
+      </w:r>
+      <w:bookmarkStart w:id="2" w:name="_Toc179213720"/>
+      <w:r>
         <w:t>Servicios de transferencia:</w:t>
       </w:r>
+      <w:bookmarkEnd w:id="2"/>
     </w:p>
     <w:p>
       <w:r>
@@ -617,9 +2807,11 @@
       <w:pPr>
         <w:pStyle w:val="Ttulo2"/>
       </w:pPr>
+      <w:bookmarkStart w:id="3" w:name="_Toc179213721"/>
       <w:r>
         <w:t>FTP- Características:</w:t>
       </w:r>
+      <w:bookmarkEnd w:id="3"/>
     </w:p>
     <w:p>
       <w:r>
@@ -642,9 +2834,11 @@
       <w:pPr>
         <w:pStyle w:val="Ttulo2"/>
       </w:pPr>
+      <w:bookmarkStart w:id="4" w:name="_Toc179213722"/>
       <w:r>
         <w:t>Componentes:</w:t>
       </w:r>
+      <w:bookmarkEnd w:id="4"/>
     </w:p>
     <w:p>
       <w:r>
@@ -670,9 +2864,11 @@
       <w:pPr>
         <w:pStyle w:val="Ttulo2"/>
       </w:pPr>
+      <w:bookmarkStart w:id="5" w:name="_Toc179213723"/>
       <w:r>
         <w:t>Servidores:</w:t>
       </w:r>
+      <w:bookmarkEnd w:id="5"/>
     </w:p>
     <w:p>
       <w:r>
@@ -716,9 +2912,11 @@
       <w:pPr>
         <w:pStyle w:val="Ttulo2"/>
       </w:pPr>
+      <w:bookmarkStart w:id="6" w:name="_Toc179213724"/>
       <w:r>
         <w:t>Clientes FTP:</w:t>
       </w:r>
+      <w:bookmarkEnd w:id="6"/>
     </w:p>
     <w:p>
       <w:r>
@@ -729,9 +2927,11 @@
       <w:pPr>
         <w:pStyle w:val="Ttulo2"/>
       </w:pPr>
+      <w:bookmarkStart w:id="7" w:name="_Toc179213725"/>
       <w:r>
         <w:t>Clientes por línea de comandos:</w:t>
       </w:r>
+      <w:bookmarkEnd w:id="7"/>
     </w:p>
     <w:p>
       <w:r>
@@ -782,10 +2982,12 @@
       <w:pPr>
         <w:pStyle w:val="Ttulo2"/>
       </w:pPr>
+      <w:bookmarkStart w:id="8" w:name="_Toc179213726"/>
       <w:r>
         <w:lastRenderedPageBreak/>
         <w:t>Clientes gráficos:</w:t>
       </w:r>
+      <w:bookmarkEnd w:id="8"/>
     </w:p>
     <w:p>
       <w:r>
@@ -808,9 +3010,11 @@
       <w:pPr>
         <w:pStyle w:val="Ttulo2"/>
       </w:pPr>
+      <w:bookmarkStart w:id="9" w:name="_Toc179213727"/>
       <w:r>
         <w:t>Navegadores y exploradores:</w:t>
       </w:r>
+      <w:bookmarkEnd w:id="9"/>
     </w:p>
     <w:p>
       <w:pPr>
@@ -985,9 +3189,11 @@
       <w:pPr>
         <w:pStyle w:val="Ttulo2"/>
       </w:pPr>
+      <w:bookmarkStart w:id="10" w:name="_Toc179213728"/>
       <w:r>
         <w:t>Protocolo FTP:</w:t>
       </w:r>
+      <w:bookmarkEnd w:id="10"/>
     </w:p>
     <w:p>
       <w:r>
@@ -1082,9 +3288,11 @@
       <w:pPr>
         <w:pStyle w:val="Ttulo2"/>
       </w:pPr>
+      <w:bookmarkStart w:id="11" w:name="_Toc179213729"/>
       <w:r>
         <w:t>Tipos de acceso:</w:t>
       </w:r>
+      <w:bookmarkEnd w:id="11"/>
     </w:p>
     <w:p>
       <w:pPr>
@@ -1448,9 +3656,11 @@
       <w:pPr>
         <w:pStyle w:val="Ttulo2"/>
       </w:pPr>
+      <w:bookmarkStart w:id="12" w:name="_Toc179213730"/>
       <w:r>
         <w:t>Conexiones:</w:t>
       </w:r>
+      <w:bookmarkEnd w:id="12"/>
     </w:p>
     <w:p>
       <w:r>
@@ -1461,9 +3671,11 @@
       <w:pPr>
         <w:pStyle w:val="Ttulo2"/>
       </w:pPr>
+      <w:bookmarkStart w:id="13" w:name="_Toc179213731"/>
       <w:r>
         <w:t>Conexión de control:</w:t>
       </w:r>
+      <w:bookmarkEnd w:id="13"/>
     </w:p>
     <w:p>
       <w:pPr>
@@ -1486,9 +3698,11 @@
       <w:pPr>
         <w:pStyle w:val="Ttulo2"/>
       </w:pPr>
+      <w:bookmarkStart w:id="14" w:name="_Toc179213732"/>
       <w:r>
         <w:t>Conexión de datos:</w:t>
       </w:r>
+      <w:bookmarkEnd w:id="14"/>
     </w:p>
     <w:p>
       <w:r>
@@ -1523,9 +3737,11 @@
       <w:pPr>
         <w:pStyle w:val="Ttulo2"/>
       </w:pPr>
+      <w:bookmarkStart w:id="15" w:name="_Toc179213733"/>
       <w:r>
         <w:t>Conexiones:</w:t>
       </w:r>
+      <w:bookmarkEnd w:id="15"/>
     </w:p>
     <w:p>
       <w:r>
@@ -1553,9 +3769,11 @@
       <w:pPr>
         <w:pStyle w:val="Ttulo2"/>
       </w:pPr>
+      <w:bookmarkStart w:id="16" w:name="_Toc179213734"/>
       <w:r>
         <w:t>Modos de conexión</w:t>
       </w:r>
+      <w:bookmarkEnd w:id="16"/>
     </w:p>
     <w:p>
       <w:pPr>
@@ -1565,9 +3783,11 @@
           <w:numId w:val="3"/>
         </w:numPr>
       </w:pPr>
+      <w:bookmarkStart w:id="17" w:name="_Toc179213735"/>
       <w:r>
         <w:t>Modo activo</w:t>
       </w:r>
+      <w:bookmarkEnd w:id="17"/>
     </w:p>
     <w:p>
       <w:pPr>
@@ -1667,11 +3887,13 @@
           <w:color w:val="77230C"/>
         </w:rPr>
       </w:pPr>
-      <w:bookmarkStart w:id="0" w:name="_heading=h.eerjtvqy9b5p" w:colFirst="0" w:colLast="0"/>
-      <w:bookmarkEnd w:id="0"/>
+      <w:bookmarkStart w:id="18" w:name="_heading=h.eerjtvqy9b5p" w:colFirst="0" w:colLast="0"/>
+      <w:bookmarkStart w:id="19" w:name="_Toc179213736"/>
+      <w:bookmarkEnd w:id="18"/>
       <w:r>
         <w:t>Modo pasivo:</w:t>
       </w:r>
+      <w:bookmarkEnd w:id="19"/>
     </w:p>
     <w:p>
       <w:pPr>
@@ -1727,8 +3949,13 @@
         <w:pStyle w:val="Ttulo1"/>
       </w:pPr>
       <w:r>
-        <w:t xml:space="preserve"> Tipos de transferencia de archivos</w:t>
-      </w:r>
+        <w:t xml:space="preserve"> </w:t>
+      </w:r>
+      <w:bookmarkStart w:id="20" w:name="_Toc179213737"/>
+      <w:r>
+        <w:t>Tipos de transferencia de archivos</w:t>
+      </w:r>
+      <w:bookmarkEnd w:id="20"/>
     </w:p>
     <w:p>
       <w:pPr>
@@ -1808,9 +4035,11 @@
       <w:pPr>
         <w:pStyle w:val="Ttulo1"/>
       </w:pPr>
+      <w:bookmarkStart w:id="21" w:name="_Toc179213738"/>
       <w:r>
         <w:t>(in)Seguridad</w:t>
       </w:r>
+      <w:bookmarkEnd w:id="21"/>
     </w:p>
     <w:p/>
     <w:p>
@@ -1874,9 +4103,11 @@
       <w:pPr>
         <w:pStyle w:val="Ttulo1"/>
       </w:pPr>
+      <w:bookmarkStart w:id="22" w:name="_Toc179213739"/>
       <w:r>
         <w:t>FTPS (FTP/SSL)</w:t>
       </w:r>
+      <w:bookmarkEnd w:id="22"/>
     </w:p>
     <w:p>
       <w:pPr>
@@ -1891,8 +4122,13 @@
         <w:pStyle w:val="Ttulo2"/>
       </w:pPr>
       <w:r>
-        <w:t xml:space="preserve"> FTPS Implícito</w:t>
-      </w:r>
+        <w:t xml:space="preserve"> </w:t>
+      </w:r>
+      <w:bookmarkStart w:id="23" w:name="_Toc179213740"/>
+      <w:r>
+        <w:t>FTPS Implícito</w:t>
+      </w:r>
+      <w:bookmarkEnd w:id="23"/>
     </w:p>
     <w:p>
       <w:pPr>
@@ -1919,8 +4155,13 @@
         <w:pStyle w:val="Ttulo2"/>
       </w:pPr>
       <w:r>
-        <w:t xml:space="preserve"> FTPS Explícito (FTPES)</w:t>
-      </w:r>
+        <w:t xml:space="preserve"> </w:t>
+      </w:r>
+      <w:bookmarkStart w:id="24" w:name="_Toc179213741"/>
+      <w:r>
+        <w:t>FTPS Explícito (FTPES)</w:t>
+      </w:r>
+      <w:bookmarkEnd w:id="24"/>
     </w:p>
     <w:p>
       <w:pPr>
@@ -1963,9 +4204,11 @@
       <w:r>
         <w:t xml:space="preserve"> </w:t>
       </w:r>
+      <w:bookmarkStart w:id="25" w:name="_Toc179213742"/>
       <w:r>
         <w:t>Fundamentación teórica</w:t>
       </w:r>
+      <w:bookmarkEnd w:id="25"/>
       <w:r>
         <w:t xml:space="preserve"> </w:t>
       </w:r>
@@ -1975,12 +4218,14 @@
     </w:p>
     <w:p/>
     <w:p>
+      <w:bookmarkStart w:id="26" w:name="_Toc179213743"/>
       <w:r>
         <w:rPr>
           <w:rStyle w:val="Ttulo2Car"/>
         </w:rPr>
         <w:t>Investiga, explica cómo funcionan y las diferencias que tienen los servicios p2p, SMB y FTP</w:t>
       </w:r>
+      <w:bookmarkEnd w:id="26"/>
       <w:r>
         <w:t>.</w:t>
       </w:r>
@@ -2146,18 +4391,22 @@
       <w:pPr>
         <w:pStyle w:val="Ttulo2"/>
       </w:pPr>
+      <w:bookmarkStart w:id="27" w:name="_Toc179213744"/>
       <w:r>
         <w:lastRenderedPageBreak/>
         <w:t>Investiga y realiza una comparativa entre distintos servidores(software) FTP</w:t>
       </w:r>
+      <w:bookmarkEnd w:id="27"/>
     </w:p>
     <w:p>
       <w:pPr>
         <w:pStyle w:val="Ttulo2"/>
       </w:pPr>
+      <w:bookmarkStart w:id="28" w:name="_Toc179213745"/>
       <w:r>
         <w:t>¿Qué son los RFCs?</w:t>
       </w:r>
+      <w:bookmarkEnd w:id="28"/>
     </w:p>
     <w:tbl>
       <w:tblPr>
@@ -2959,9 +5208,11 @@
       <w:pPr>
         <w:pStyle w:val="Ttulo2"/>
       </w:pPr>
+      <w:bookmarkStart w:id="29" w:name="_Toc179213746"/>
       <w:r>
         <w:t>¿Qué son los RFCs?</w:t>
       </w:r>
+      <w:bookmarkEnd w:id="29"/>
     </w:p>
     <w:p>
       <w:r>
@@ -2997,9 +5248,11 @@
       <w:pPr>
         <w:pStyle w:val="Ttulo2"/>
       </w:pPr>
+      <w:bookmarkStart w:id="30" w:name="_Toc179213747"/>
       <w:r>
         <w:t>¿Qué ventajas ofrece el modo activo en FTP?</w:t>
       </w:r>
+      <w:bookmarkEnd w:id="30"/>
     </w:p>
     <w:p>
       <w:r>
@@ -3032,10 +5285,12 @@
       <w:pPr>
         <w:pStyle w:val="Ttulo1"/>
       </w:pPr>
+      <w:bookmarkStart w:id="31" w:name="_Toc179213748"/>
       <w:r>
         <w:lastRenderedPageBreak/>
         <w:t>Reflexión personal</w:t>
       </w:r>
+      <w:bookmarkEnd w:id="31"/>
     </w:p>
     <w:p>
       <w:pPr>
@@ -3044,12 +5299,14 @@
           <w:rStyle w:val="Ttulo2Car"/>
         </w:rPr>
       </w:pPr>
+      <w:bookmarkStart w:id="32" w:name="_Toc179213749"/>
       <w:r>
         <w:rPr>
           <w:rStyle w:val="Ttulo2Car"/>
         </w:rPr>
         <w:t>¿Qué mecanismos de transferencia de archivos has utilizado? Cuenta tu experiencia.</w:t>
       </w:r>
+      <w:bookmarkEnd w:id="32"/>
     </w:p>
     <w:p>
       <w:pPr>
@@ -3059,31 +5316,37 @@
       </w:pPr>
       <w:r>
         <w:rPr>
-          <w:rFonts w:asciiTheme="minorHAnsi" w:hAnsiTheme="minorHAnsi" w:cs="Arial"/>
-          <w:color w:val="000000"/>
-        </w:rPr>
-        <w:t xml:space="preserve">De todos, el que más uso le he dado se podría decir que ha sido </w:t>
-      </w:r>
-      <w:r>
-        <w:rPr>
-          <w:rStyle w:val="Textoennegrita"/>
-          <w:rFonts w:asciiTheme="minorHAnsi" w:hAnsiTheme="minorHAnsi" w:cs="Arial"/>
-        </w:rPr>
-        <w:t>P2P</w:t>
-      </w:r>
-      <w:r>
-        <w:rPr>
-          <w:rStyle w:val="Textoennegrita"/>
-          <w:rFonts w:asciiTheme="minorHAnsi" w:hAnsiTheme="minorHAnsi"/>
-        </w:rPr>
-        <w:t xml:space="preserve"> </w:t>
-      </w:r>
-      <w:r>
-        <w:rPr>
-          <w:rFonts w:asciiTheme="minorHAnsi" w:hAnsiTheme="minorHAnsi" w:cs="Arial"/>
-          <w:color w:val="000000"/>
-        </w:rPr>
-        <w:t>mediante aplicaciones como uTorrent o qbTorrent para la descarga de archivos de gran tamaño y el FTPS para la descarga de archivos de internet.</w:t>
+          <w:rStyle w:val="SinespaciadoCar"/>
+        </w:rPr>
+        <w:t xml:space="preserve">De todos, el que más uso le he dado se podría decir que ha sido P2P mediante aplicaciones como </w:t>
+      </w:r>
+      <w:proofErr w:type="spellStart"/>
+      <w:r>
+        <w:rPr>
+          <w:rStyle w:val="SinespaciadoCar"/>
+        </w:rPr>
+        <w:t>uTorrent</w:t>
+      </w:r>
+      <w:proofErr w:type="spellEnd"/>
+      <w:r>
+        <w:rPr>
+          <w:rStyle w:val="SinespaciadoCar"/>
+        </w:rPr>
+        <w:t xml:space="preserve"> o </w:t>
+      </w:r>
+      <w:proofErr w:type="spellStart"/>
+      <w:r>
+        <w:rPr>
+          <w:rStyle w:val="SinespaciadoCar"/>
+        </w:rPr>
+        <w:t>qbTorrent</w:t>
+      </w:r>
+      <w:proofErr w:type="spellEnd"/>
+      <w:r>
+        <w:rPr>
+          <w:rStyle w:val="SinespaciadoCar"/>
+        </w:rPr>
+        <w:t xml:space="preserve"> para la descarga de archivos de gran tamaño y el FTPS para la descarga de archivos de internet.</w:t>
       </w:r>
       <w:r>
         <w:rPr>
@@ -3104,17 +5367,18 @@
         <w:pStyle w:val="Sinespaciado"/>
         <w:rPr>
           <w:rStyle w:val="Ttulo2Car"/>
-          <w:rFonts w:asciiTheme="minorHAnsi" w:eastAsiaTheme="minorEastAsia" w:hAnsiTheme="minorHAnsi" w:cs="Arial"/>
+          <w:rFonts w:ascii="Calibri" w:eastAsiaTheme="minorEastAsia" w:hAnsi="Calibri" w:cs="Calibri"/>
           <w:i w:val="0"/>
           <w:color w:val="auto"/>
           <w:sz w:val="22"/>
           <w:szCs w:val="22"/>
         </w:rPr>
       </w:pPr>
+      <w:bookmarkStart w:id="33" w:name="_Toc179213750"/>
       <w:r>
         <w:rPr>
           <w:rStyle w:val="Ttulo2Car"/>
-          <w:rFonts w:asciiTheme="minorHAnsi" w:eastAsiaTheme="minorEastAsia" w:hAnsiTheme="minorHAnsi" w:cs="Arial"/>
+          <w:rFonts w:ascii="Calibri" w:eastAsiaTheme="minorEastAsia" w:hAnsi="Calibri" w:cs="Calibri"/>
           <w:i w:val="0"/>
           <w:color w:val="auto"/>
           <w:sz w:val="22"/>
@@ -3122,6 +5386,7 @@
         </w:rPr>
         <w:t>Contar con un servidor web que cumpla la función de servidor FTP resulta conveniente para los desarrolladores, ya que simplifica el despliegue y la administración ágil de archivos, posibilita la inclusión de herramientas de desarrollo y la gestión de usuarios y permisos. Proporciona a los usuarios una manera fácil de cargar contenido y obtener acceso a archivos de forma remota, lo que facilita la actualización y administración de recursos sin complicaciones.</w:t>
       </w:r>
+      <w:bookmarkEnd w:id="33"/>
     </w:p>
     <w:p/>
     <w:p>
@@ -4451,6 +6716,67 @@
       <w:bCs/>
     </w:rPr>
   </w:style>
+  <w:style w:type="paragraph" w:styleId="TtuloTDC">
+    <w:name w:val="TOC Heading"/>
+    <w:basedOn w:val="Ttulo1"/>
+    <w:next w:val="Normal"/>
+    <w:uiPriority w:val="39"/>
+    <w:unhideWhenUsed/>
+    <w:qFormat/>
+    <w:rsid w:val="00C6136C"/>
+    <w:pPr>
+      <w:outlineLvl w:val="9"/>
+    </w:pPr>
+  </w:style>
+  <w:style w:type="paragraph" w:styleId="TDC1">
+    <w:name w:val="toc 1"/>
+    <w:basedOn w:val="Normal"/>
+    <w:next w:val="Normal"/>
+    <w:autoRedefine/>
+    <w:uiPriority w:val="39"/>
+    <w:unhideWhenUsed/>
+    <w:rsid w:val="00C6136C"/>
+    <w:pPr>
+      <w:spacing w:after="100"/>
+    </w:pPr>
+  </w:style>
+  <w:style w:type="paragraph" w:styleId="TDC2">
+    <w:name w:val="toc 2"/>
+    <w:basedOn w:val="Normal"/>
+    <w:next w:val="Normal"/>
+    <w:autoRedefine/>
+    <w:uiPriority w:val="39"/>
+    <w:unhideWhenUsed/>
+    <w:rsid w:val="00C6136C"/>
+    <w:pPr>
+      <w:spacing w:after="100"/>
+      <w:ind w:left="220"/>
+    </w:pPr>
+  </w:style>
+  <w:style w:type="paragraph" w:styleId="TDC3">
+    <w:name w:val="toc 3"/>
+    <w:basedOn w:val="Normal"/>
+    <w:next w:val="Normal"/>
+    <w:autoRedefine/>
+    <w:uiPriority w:val="39"/>
+    <w:unhideWhenUsed/>
+    <w:rsid w:val="00C6136C"/>
+    <w:pPr>
+      <w:spacing w:after="100"/>
+      <w:ind w:left="440"/>
+    </w:pPr>
+  </w:style>
+  <w:style w:type="character" w:styleId="Hipervnculo">
+    <w:name w:val="Hyperlink"/>
+    <w:basedOn w:val="Fuentedeprrafopredeter"/>
+    <w:uiPriority w:val="99"/>
+    <w:unhideWhenUsed/>
+    <w:rsid w:val="00C6136C"/>
+    <w:rPr>
+      <w:color w:val="CC9900" w:themeColor="hyperlink"/>
+      <w:u w:val="single"/>
+    </w:rPr>
+  </w:style>
 </w:styles>
 </file>
 
@@ -4755,6 +7081,10 @@
 </go:gDocsCustomXmlDataStorage>
 </file>
 
+<file path=customXml/item2.xml><?xml version="1.0" encoding="utf-8"?>
+<b:Sources xmlns:b="http://schemas.openxmlformats.org/officeDocument/2006/bibliography" xmlns="http://schemas.openxmlformats.org/officeDocument/2006/bibliography" SelectedStyle="\APASixthEditionOfficeOnline.xsl" StyleName="APA" Version="6"/>
+</file>
+
 <file path=customXml/itemProps1.xml><?xml version="1.0" encoding="utf-8"?>
 <ds:datastoreItem xmlns:ds="http://schemas.openxmlformats.org/officeDocument/2006/customXml" ds:itemID="{11111111-1234-1234-1234-123412341234}">
   <ds:schemaRefs>
@@ -4762,4 +7092,12 @@
     <ds:schemaRef ds:uri="http://schemas.openxmlformats.org/officeDocument/2006/relationships"/>
   </ds:schemaRefs>
 </ds:datastoreItem>
+</file>
+
+<file path=customXml/itemProps2.xml><?xml version="1.0" encoding="utf-8"?>
+<ds:datastoreItem xmlns:ds="http://schemas.openxmlformats.org/officeDocument/2006/customXml" ds:itemID="{552B1671-3F1B-4F3A-8B68-CF69407F7C6A}">
+  <ds:schemaRefs>
+    <ds:schemaRef ds:uri="http://schemas.openxmlformats.org/officeDocument/2006/bibliography"/>
+  </ds:schemaRefs>
+</ds:datastoreItem>
 </file>
</xml_diff>